<commit_message>
Updated some functionality and documents to append/handle overflow fields.
</commit_message>
<xml_diff>
--- a/docassemble/UIAppealAfterHearing/data/templates/additional_attachments.docx
+++ b/docassemble/UIAppealAfterHearing/data/templates/additional_attachments.docx
@@ -78,15 +78,7 @@
           <w:sz w:val="24"/>
           <w:szCs w:val="24"/>
         </w:rPr>
-        <w:t xml:space="preserve"> ID/SSN: </w:t>
-      </w:r>
-      <w:r>
-        <w:rPr>
-          <w:rFonts w:ascii="Times New Roman" w:hAnsi="Times New Roman" w:cs="Times New Roman"/>
-          <w:sz w:val="24"/>
-          <w:szCs w:val="24"/>
-        </w:rPr>
-        <w:t>{{ (users[0].</w:t>
+        <w:t xml:space="preserve"> ID/SSN: {{ (users[0].</w:t>
       </w:r>
       <w:proofErr w:type="spellStart"/>
       <w:r>
@@ -131,15 +123,7 @@
           <w:sz w:val="24"/>
           <w:szCs w:val="24"/>
         </w:rPr>
-        <w:t>{</w:t>
-      </w:r>
-      <w:r>
-        <w:rPr>
-          <w:rFonts w:ascii="Times New Roman" w:hAnsi="Times New Roman" w:cs="Times New Roman"/>
-          <w:sz w:val="24"/>
-          <w:szCs w:val="24"/>
-        </w:rPr>
-        <w:t xml:space="preserve">{ </w:t>
+        <w:t xml:space="preserve">{{ </w:t>
       </w:r>
       <w:proofErr w:type="spellStart"/>
       <w:r>
@@ -184,15 +168,7 @@
           <w:sz w:val="24"/>
           <w:szCs w:val="24"/>
         </w:rPr>
-        <w:t>") }</w:t>
-      </w:r>
-      <w:r>
-        <w:rPr>
-          <w:rFonts w:ascii="Times New Roman" w:hAnsi="Times New Roman" w:cs="Times New Roman"/>
-          <w:sz w:val="24"/>
-          <w:szCs w:val="24"/>
-        </w:rPr>
-        <w:t>}</w:t>
+        <w:t>") }}</w:t>
       </w:r>
     </w:p>
     <w:p>
@@ -235,15 +211,7 @@
           <w:sz w:val="24"/>
           <w:szCs w:val="24"/>
         </w:rPr>
-        <w:t>{</w:t>
-      </w:r>
-      <w:r>
-        <w:rPr>
-          <w:rFonts w:ascii="Times New Roman" w:hAnsi="Times New Roman" w:cs="Times New Roman"/>
-          <w:sz w:val="24"/>
-          <w:szCs w:val="24"/>
-        </w:rPr>
-        <w:t xml:space="preserve">{ </w:t>
+        <w:t xml:space="preserve">{{ </w:t>
       </w:r>
       <w:proofErr w:type="spellStart"/>
       <w:r>
@@ -270,15 +238,7 @@
           <w:sz w:val="24"/>
           <w:szCs w:val="24"/>
         </w:rPr>
-        <w:t xml:space="preserve"> }</w:t>
-      </w:r>
-      <w:r>
-        <w:rPr>
-          <w:rFonts w:ascii="Times New Roman" w:hAnsi="Times New Roman" w:cs="Times New Roman"/>
-          <w:sz w:val="24"/>
-          <w:szCs w:val="24"/>
-        </w:rPr>
-        <w:t>}</w:t>
+        <w:t xml:space="preserve"> }}</w:t>
       </w:r>
     </w:p>
     <w:p>
@@ -289,6 +249,59 @@
           <w:szCs w:val="24"/>
         </w:rPr>
       </w:pPr>
+    </w:p>
+    <w:p>
+      <w:pPr>
+        <w:spacing w:after="0"/>
+        <w:rPr>
+          <w:rFonts w:ascii="Times New Roman" w:hAnsi="Times New Roman" w:cs="Times New Roman"/>
+          <w:sz w:val="24"/>
+          <w:szCs w:val="24"/>
+        </w:rPr>
+      </w:pPr>
+      <w:r>
+        <w:rPr>
+          <w:rFonts w:ascii="Times New Roman" w:hAnsi="Times New Roman" w:cs="Times New Roman"/>
+          <w:sz w:val="24"/>
+          <w:szCs w:val="24"/>
+        </w:rPr>
+        <w:t>{%p if</w:t>
+      </w:r>
+      <w:r>
+        <w:rPr>
+          <w:rFonts w:ascii="Consolas" w:eastAsia="Times New Roman" w:hAnsi="Consolas" w:cs="Times New Roman"/>
+          <w:color w:val="CCCCCC"/>
+          <w:kern w:val="0"/>
+          <w:sz w:val="21"/>
+          <w:szCs w:val="21"/>
+          <w14:ligatures w14:val="none"/>
+        </w:rPr>
+        <w:t xml:space="preserve"> </w:t>
+      </w:r>
+      <w:r>
+        <w:rPr>
+          <w:rFonts w:ascii="Times New Roman" w:hAnsi="Times New Roman" w:cs="Times New Roman"/>
+          <w:sz w:val="24"/>
+          <w:szCs w:val="24"/>
+        </w:rPr>
+        <w:t>attachments</w:t>
+      </w:r>
+      <w:r>
+        <w:rPr>
+          <w:rFonts w:ascii="Times New Roman" w:hAnsi="Times New Roman" w:cs="Times New Roman"/>
+          <w:sz w:val="24"/>
+          <w:szCs w:val="24"/>
+        </w:rPr>
+        <w:t xml:space="preserve"> | length &gt;= 2</w:t>
+      </w:r>
+      <w:r>
+        <w:rPr>
+          <w:rFonts w:ascii="Times New Roman" w:hAnsi="Times New Roman" w:cs="Times New Roman"/>
+          <w:sz w:val="24"/>
+          <w:szCs w:val="24"/>
+        </w:rPr>
+        <w:t xml:space="preserve"> %}</w:t>
+      </w:r>
     </w:p>
     <w:p>
       <w:pPr>
@@ -430,6 +443,210 @@
         </w:rPr>
         <w:t xml:space="preserve"> %}</w:t>
       </w:r>
+    </w:p>
+    <w:p>
+      <w:pPr>
+        <w:spacing w:after="0" w:line="240" w:lineRule="auto"/>
+        <w:rPr>
+          <w:rFonts w:ascii="Times New Roman" w:hAnsi="Times New Roman" w:cs="Times New Roman"/>
+          <w:sz w:val="24"/>
+          <w:szCs w:val="24"/>
+        </w:rPr>
+      </w:pPr>
+      <w:r>
+        <w:rPr>
+          <w:rFonts w:ascii="Times New Roman" w:hAnsi="Times New Roman" w:cs="Times New Roman"/>
+          <w:sz w:val="24"/>
+          <w:szCs w:val="24"/>
+        </w:rPr>
+        <w:t xml:space="preserve">{%p </w:t>
+      </w:r>
+      <w:r>
+        <w:rPr>
+          <w:rFonts w:ascii="Times New Roman" w:hAnsi="Times New Roman" w:cs="Times New Roman"/>
+          <w:sz w:val="24"/>
+          <w:szCs w:val="24"/>
+        </w:rPr>
+        <w:t>endif</w:t>
+      </w:r>
+      <w:r>
+        <w:rPr>
+          <w:rFonts w:ascii="Times New Roman" w:hAnsi="Times New Roman" w:cs="Times New Roman"/>
+          <w:sz w:val="24"/>
+          <w:szCs w:val="24"/>
+        </w:rPr>
+        <w:t xml:space="preserve"> %}</w:t>
+      </w:r>
+    </w:p>
+    <w:p>
+      <w:pPr>
+        <w:spacing w:after="0" w:line="240" w:lineRule="auto"/>
+        <w:rPr>
+          <w:rFonts w:ascii="Times New Roman" w:hAnsi="Times New Roman" w:cs="Times New Roman"/>
+          <w:sz w:val="24"/>
+          <w:szCs w:val="24"/>
+        </w:rPr>
+      </w:pPr>
+    </w:p>
+    <w:p>
+      <w:pPr>
+        <w:spacing w:after="0" w:line="240" w:lineRule="auto"/>
+        <w:rPr>
+          <w:rFonts w:ascii="Times New Roman" w:hAnsi="Times New Roman" w:cs="Times New Roman"/>
+          <w:sz w:val="24"/>
+          <w:szCs w:val="24"/>
+        </w:rPr>
+      </w:pPr>
+      <w:r>
+        <w:rPr>
+          <w:rFonts w:ascii="Times New Roman" w:hAnsi="Times New Roman" w:cs="Times New Roman"/>
+          <w:sz w:val="24"/>
+          <w:szCs w:val="24"/>
+        </w:rPr>
+        <w:t xml:space="preserve">{%p if </w:t>
+      </w:r>
+      <w:proofErr w:type="spellStart"/>
+      <w:r>
+        <w:rPr>
+          <w:rFonts w:ascii="Times New Roman" w:hAnsi="Times New Roman" w:cs="Times New Roman"/>
+          <w:sz w:val="24"/>
+          <w:szCs w:val="24"/>
+        </w:rPr>
+        <w:t>appeal_reason</w:t>
+      </w:r>
+      <w:proofErr w:type="spellEnd"/>
+      <w:r>
+        <w:rPr>
+          <w:rFonts w:ascii="Times New Roman" w:hAnsi="Times New Roman" w:cs="Times New Roman"/>
+          <w:sz w:val="24"/>
+          <w:szCs w:val="24"/>
+        </w:rPr>
+        <w:t xml:space="preserve"> | length &gt; 600 %}</w:t>
+      </w:r>
+    </w:p>
+    <w:p>
+      <w:pPr>
+        <w:spacing w:after="0"/>
+        <w:rPr>
+          <w:rFonts w:ascii="Times New Roman" w:hAnsi="Times New Roman" w:cs="Times New Roman"/>
+          <w:sz w:val="24"/>
+          <w:szCs w:val="24"/>
+        </w:rPr>
+      </w:pPr>
+      <w:r>
+        <w:rPr>
+          <w:rFonts w:ascii="Times New Roman" w:hAnsi="Times New Roman" w:cs="Times New Roman"/>
+          <w:sz w:val="24"/>
+          <w:szCs w:val="24"/>
+        </w:rPr>
+        <w:t>I disagree with the decision for the following reasons:</w:t>
+      </w:r>
+    </w:p>
+    <w:p>
+      <w:pPr>
+        <w:spacing w:after="0" w:line="240" w:lineRule="auto"/>
+        <w:rPr>
+          <w:rFonts w:ascii="Times New Roman" w:hAnsi="Times New Roman" w:cs="Times New Roman"/>
+          <w:sz w:val="24"/>
+          <w:szCs w:val="24"/>
+        </w:rPr>
+      </w:pPr>
+      <w:proofErr w:type="gramStart"/>
+      <w:r>
+        <w:rPr>
+          <w:rFonts w:ascii="Times New Roman" w:hAnsi="Times New Roman" w:cs="Times New Roman"/>
+          <w:sz w:val="24"/>
+          <w:szCs w:val="24"/>
+        </w:rPr>
+        <w:t>{</w:t>
+      </w:r>
+      <w:r>
+        <w:rPr>
+          <w:rFonts w:ascii="Times New Roman" w:hAnsi="Times New Roman" w:cs="Times New Roman"/>
+          <w:sz w:val="24"/>
+          <w:szCs w:val="24"/>
+        </w:rPr>
+        <w:t xml:space="preserve">{ </w:t>
+      </w:r>
+      <w:proofErr w:type="spellStart"/>
+      <w:r>
+        <w:rPr>
+          <w:rFonts w:ascii="Times New Roman" w:hAnsi="Times New Roman" w:cs="Times New Roman"/>
+          <w:sz w:val="24"/>
+          <w:szCs w:val="24"/>
+        </w:rPr>
+        <w:t>appeal</w:t>
+      </w:r>
+      <w:proofErr w:type="gramEnd"/>
+      <w:r>
+        <w:rPr>
+          <w:rFonts w:ascii="Times New Roman" w:hAnsi="Times New Roman" w:cs="Times New Roman"/>
+          <w:sz w:val="24"/>
+          <w:szCs w:val="24"/>
+        </w:rPr>
+        <w:t>_reason</w:t>
+      </w:r>
+      <w:proofErr w:type="spellEnd"/>
+      <w:r>
+        <w:rPr>
+          <w:rFonts w:ascii="Times New Roman" w:hAnsi="Times New Roman" w:cs="Times New Roman"/>
+          <w:sz w:val="24"/>
+          <w:szCs w:val="24"/>
+        </w:rPr>
+        <w:t xml:space="preserve"> }}</w:t>
+      </w:r>
+    </w:p>
+    <w:p>
+      <w:pPr>
+        <w:spacing w:after="0" w:line="240" w:lineRule="auto"/>
+        <w:rPr>
+          <w:rFonts w:ascii="Times New Roman" w:hAnsi="Times New Roman" w:cs="Times New Roman"/>
+          <w:sz w:val="24"/>
+          <w:szCs w:val="24"/>
+        </w:rPr>
+      </w:pPr>
+      <w:r>
+        <w:rPr>
+          <w:rFonts w:ascii="Times New Roman" w:hAnsi="Times New Roman" w:cs="Times New Roman"/>
+          <w:sz w:val="24"/>
+          <w:szCs w:val="24"/>
+        </w:rPr>
+        <w:t xml:space="preserve">{%p </w:t>
+      </w:r>
+      <w:r>
+        <w:rPr>
+          <w:rFonts w:ascii="Times New Roman" w:hAnsi="Times New Roman" w:cs="Times New Roman"/>
+          <w:sz w:val="24"/>
+          <w:szCs w:val="24"/>
+        </w:rPr>
+        <w:t>endif</w:t>
+      </w:r>
+      <w:r>
+        <w:rPr>
+          <w:rFonts w:ascii="Times New Roman" w:hAnsi="Times New Roman" w:cs="Times New Roman"/>
+          <w:sz w:val="24"/>
+          <w:szCs w:val="24"/>
+        </w:rPr>
+        <w:t xml:space="preserve"> </w:t>
+      </w:r>
+      <w:r>
+        <w:rPr>
+          <w:rFonts w:ascii="Times New Roman" w:hAnsi="Times New Roman" w:cs="Times New Roman"/>
+          <w:sz w:val="24"/>
+          <w:szCs w:val="24"/>
+        </w:rPr>
+        <w:t>%}</w:t>
+      </w:r>
+    </w:p>
+    <w:p>
+      <w:pPr>
+        <w:spacing w:after="0" w:line="240" w:lineRule="auto"/>
+        <w:rPr>
+          <w:rFonts w:ascii="Times New Roman" w:hAnsi="Times New Roman" w:cs="Times New Roman"/>
+          <w:sz w:val="24"/>
+          <w:szCs w:val="24"/>
+        </w:rPr>
+      </w:pPr>
     </w:p>
     <w:sectPr>
       <w:pgSz w:w="12240" w:h="15840"/>
@@ -1166,6 +1383,7 @@
   <w:style w:type="character" w:default="1" w:styleId="DefaultParagraphFont">
     <w:name w:val="Default Paragraph Font"/>
     <w:uiPriority w:val="1"/>
+    <w:semiHidden/>
     <w:unhideWhenUsed/>
   </w:style>
   <w:style w:type="table" w:default="1" w:styleId="TableNormal">

</xml_diff>

<commit_message>
Updates to the addendum handling for additional documents and/or appeal length.
</commit_message>
<xml_diff>
--- a/docassemble/UIAppealAfterHearing/data/templates/additional_attachments.docx
+++ b/docassemble/UIAppealAfterHearing/data/templates/additional_attachments.docx
@@ -7,6 +7,8 @@
         <w:spacing w:after="0" w:line="240" w:lineRule="auto"/>
         <w:rPr>
           <w:rFonts w:ascii="Times New Roman" w:hAnsi="Times New Roman" w:cs="Times New Roman"/>
+          <w:b/>
+          <w:bCs/>
           <w:sz w:val="24"/>
           <w:szCs w:val="24"/>
         </w:rPr>
@@ -14,89 +16,32 @@
       <w:r>
         <w:rPr>
           <w:rFonts w:ascii="Times New Roman" w:hAnsi="Times New Roman" w:cs="Times New Roman"/>
-          <w:sz w:val="24"/>
-          <w:szCs w:val="24"/>
-        </w:rPr>
-        <w:t xml:space="preserve">Name: </w:t>
-      </w:r>
-      <w:proofErr w:type="gramStart"/>
-      <w:r>
-        <w:rPr>
-          <w:rFonts w:ascii="Times New Roman" w:hAnsi="Times New Roman" w:cs="Times New Roman"/>
-          <w:sz w:val="24"/>
-          <w:szCs w:val="24"/>
-        </w:rPr>
-        <w:t>{{ users</w:t>
-      </w:r>
-      <w:proofErr w:type="gramEnd"/>
-      <w:r>
-        <w:rPr>
-          <w:rFonts w:ascii="Times New Roman" w:hAnsi="Times New Roman" w:cs="Times New Roman"/>
-          <w:sz w:val="24"/>
-          <w:szCs w:val="24"/>
-        </w:rPr>
-        <w:t>[0].</w:t>
-      </w:r>
-      <w:proofErr w:type="spellStart"/>
-      <w:r>
-        <w:rPr>
-          <w:rFonts w:ascii="Times New Roman" w:hAnsi="Times New Roman" w:cs="Times New Roman"/>
-          <w:sz w:val="24"/>
-          <w:szCs w:val="24"/>
-        </w:rPr>
-        <w:t>name_full</w:t>
-      </w:r>
-      <w:proofErr w:type="spellEnd"/>
-      <w:r>
-        <w:rPr>
-          <w:rFonts w:ascii="Times New Roman" w:hAnsi="Times New Roman" w:cs="Times New Roman"/>
-          <w:sz w:val="24"/>
-          <w:szCs w:val="24"/>
-        </w:rPr>
-        <w:t>() }}</w:t>
-      </w:r>
-      <w:r>
-        <w:rPr>
-          <w:rFonts w:ascii="Times New Roman" w:hAnsi="Times New Roman" w:cs="Times New Roman"/>
-          <w:sz w:val="24"/>
-          <w:szCs w:val="24"/>
-        </w:rPr>
-        <w:br/>
-        <w:t>Claimant</w:t>
-      </w:r>
-      <w:r>
-        <w:rPr>
-          <w:rFonts w:ascii="Times New Roman" w:hAnsi="Times New Roman" w:cs="Times New Roman"/>
-          <w:sz w:val="24"/>
-          <w:szCs w:val="24"/>
-        </w:rPr>
-        <w:t>’s</w:t>
-      </w:r>
-      <w:r>
-        <w:rPr>
-          <w:rFonts w:ascii="Times New Roman" w:hAnsi="Times New Roman" w:cs="Times New Roman"/>
-          <w:sz w:val="24"/>
-          <w:szCs w:val="24"/>
-        </w:rPr>
-        <w:t xml:space="preserve"> ID/SSN: {{ (users[0].</w:t>
-      </w:r>
-      <w:proofErr w:type="spellStart"/>
-      <w:r>
-        <w:rPr>
-          <w:rFonts w:ascii="Times New Roman" w:hAnsi="Times New Roman" w:cs="Times New Roman"/>
-          <w:sz w:val="24"/>
-          <w:szCs w:val="24"/>
-        </w:rPr>
-        <w:t>id_or_ssn|int</w:t>
-      </w:r>
-      <w:proofErr w:type="spellEnd"/>
-      <w:r>
-        <w:rPr>
-          <w:rFonts w:ascii="Times New Roman" w:hAnsi="Times New Roman" w:cs="Times New Roman"/>
-          <w:sz w:val="24"/>
-          <w:szCs w:val="24"/>
-        </w:rPr>
-        <w:t>)|string }}</w:t>
+          <w:b/>
+          <w:bCs/>
+          <w:sz w:val="24"/>
+          <w:szCs w:val="24"/>
+        </w:rPr>
+        <w:t>Addendum</w:t>
+      </w:r>
+      <w:r>
+        <w:rPr>
+          <w:rFonts w:ascii="Times New Roman" w:hAnsi="Times New Roman" w:cs="Times New Roman"/>
+          <w:b/>
+          <w:bCs/>
+          <w:sz w:val="24"/>
+          <w:szCs w:val="24"/>
+        </w:rPr>
+        <w:t xml:space="preserve"> to </w:t>
+      </w:r>
+      <w:r>
+        <w:rPr>
+          <w:rFonts w:ascii="Times New Roman" w:hAnsi="Times New Roman" w:cs="Times New Roman"/>
+          <w:b/>
+          <w:bCs/>
+          <w:sz w:val="24"/>
+          <w:szCs w:val="24"/>
+        </w:rPr>
+        <w:t>Notice of Appeal / Board of Review</w:t>
       </w:r>
     </w:p>
     <w:p>
@@ -104,145 +49,407 @@
         <w:spacing w:after="0" w:line="240" w:lineRule="auto"/>
         <w:rPr>
           <w:rFonts w:ascii="Times New Roman" w:hAnsi="Times New Roman" w:cs="Times New Roman"/>
+          <w:b/>
+          <w:bCs/>
           <w:sz w:val="24"/>
           <w:szCs w:val="24"/>
         </w:rPr>
       </w:pPr>
-      <w:r>
-        <w:rPr>
-          <w:rFonts w:ascii="Times New Roman" w:hAnsi="Times New Roman" w:cs="Times New Roman"/>
-          <w:sz w:val="24"/>
-          <w:szCs w:val="24"/>
-        </w:rPr>
-        <w:t xml:space="preserve">Date Appeal Filed: </w:t>
-      </w:r>
-      <w:proofErr w:type="gramStart"/>
-      <w:r>
-        <w:rPr>
-          <w:rFonts w:ascii="Times New Roman" w:hAnsi="Times New Roman" w:cs="Times New Roman"/>
-          <w:sz w:val="24"/>
-          <w:szCs w:val="24"/>
-        </w:rPr>
-        <w:t xml:space="preserve">{{ </w:t>
-      </w:r>
-      <w:proofErr w:type="spellStart"/>
-      <w:r>
-        <w:rPr>
-          <w:rFonts w:ascii="Times New Roman" w:hAnsi="Times New Roman" w:cs="Times New Roman"/>
-          <w:sz w:val="24"/>
-          <w:szCs w:val="24"/>
-        </w:rPr>
-        <w:t>decision</w:t>
-      </w:r>
-      <w:proofErr w:type="gramEnd"/>
-      <w:r>
-        <w:rPr>
-          <w:rFonts w:ascii="Times New Roman" w:hAnsi="Times New Roman" w:cs="Times New Roman"/>
-          <w:sz w:val="24"/>
-          <w:szCs w:val="24"/>
-        </w:rPr>
-        <w:t>_date.format</w:t>
-      </w:r>
-      <w:proofErr w:type="spellEnd"/>
-      <w:r>
-        <w:rPr>
-          <w:rFonts w:ascii="Times New Roman" w:hAnsi="Times New Roman" w:cs="Times New Roman"/>
-          <w:sz w:val="24"/>
-          <w:szCs w:val="24"/>
-        </w:rPr>
-        <w:t>("MM/dd/</w:t>
-      </w:r>
-      <w:proofErr w:type="spellStart"/>
-      <w:r>
-        <w:rPr>
-          <w:rFonts w:ascii="Times New Roman" w:hAnsi="Times New Roman" w:cs="Times New Roman"/>
-          <w:sz w:val="24"/>
-          <w:szCs w:val="24"/>
-        </w:rPr>
-        <w:t>yyyy</w:t>
-      </w:r>
-      <w:proofErr w:type="spellEnd"/>
-      <w:r>
-        <w:rPr>
-          <w:rFonts w:ascii="Times New Roman" w:hAnsi="Times New Roman" w:cs="Times New Roman"/>
-          <w:sz w:val="24"/>
-          <w:szCs w:val="24"/>
-        </w:rPr>
-        <w:t>") }}</w:t>
-      </w:r>
     </w:p>
+    <w:tbl>
+      <w:tblPr>
+        <w:tblStyle w:val="TableGrid"/>
+        <w:tblW w:w="0" w:type="auto"/>
+        <w:tblLook w:val="04A0" w:firstRow="1" w:lastRow="0" w:firstColumn="1" w:lastColumn="0" w:noHBand="0" w:noVBand="1"/>
+      </w:tblPr>
+      <w:tblGrid>
+        <w:gridCol w:w="2335"/>
+        <w:gridCol w:w="7015"/>
+      </w:tblGrid>
+      <w:tr>
+        <w:trPr>
+          <w:trHeight w:val="341"/>
+        </w:trPr>
+        <w:tc>
+          <w:tcPr>
+            <w:tcW w:w="2335" w:type="dxa"/>
+          </w:tcPr>
+          <w:p>
+            <w:pPr>
+              <w:rPr>
+                <w:rFonts w:ascii="Times New Roman" w:hAnsi="Times New Roman" w:cs="Times New Roman"/>
+                <w:b/>
+                <w:bCs/>
+                <w:sz w:val="24"/>
+                <w:szCs w:val="24"/>
+              </w:rPr>
+            </w:pPr>
+            <w:r>
+              <w:rPr>
+                <w:rFonts w:ascii="Times New Roman" w:hAnsi="Times New Roman" w:cs="Times New Roman"/>
+                <w:b/>
+                <w:bCs/>
+                <w:sz w:val="24"/>
+                <w:szCs w:val="24"/>
+              </w:rPr>
+              <w:t>Name of Applicant:</w:t>
+            </w:r>
+          </w:p>
+        </w:tc>
+        <w:tc>
+          <w:tcPr>
+            <w:tcW w:w="7015" w:type="dxa"/>
+          </w:tcPr>
+          <w:p>
+            <w:pPr>
+              <w:rPr>
+                <w:rFonts w:ascii="Times New Roman" w:hAnsi="Times New Roman" w:cs="Times New Roman"/>
+                <w:b/>
+                <w:bCs/>
+                <w:sz w:val="24"/>
+                <w:szCs w:val="24"/>
+              </w:rPr>
+            </w:pPr>
+            <w:proofErr w:type="gramStart"/>
+            <w:r>
+              <w:rPr>
+                <w:rFonts w:ascii="Times New Roman" w:hAnsi="Times New Roman" w:cs="Times New Roman"/>
+                <w:sz w:val="24"/>
+                <w:szCs w:val="24"/>
+              </w:rPr>
+              <w:t>{{ users</w:t>
+            </w:r>
+            <w:proofErr w:type="gramEnd"/>
+            <w:r>
+              <w:rPr>
+                <w:rFonts w:ascii="Times New Roman" w:hAnsi="Times New Roman" w:cs="Times New Roman"/>
+                <w:sz w:val="24"/>
+                <w:szCs w:val="24"/>
+              </w:rPr>
+              <w:t>[0].</w:t>
+            </w:r>
+            <w:proofErr w:type="spellStart"/>
+            <w:r>
+              <w:rPr>
+                <w:rFonts w:ascii="Times New Roman" w:hAnsi="Times New Roman" w:cs="Times New Roman"/>
+                <w:sz w:val="24"/>
+                <w:szCs w:val="24"/>
+              </w:rPr>
+              <w:t>name_full</w:t>
+            </w:r>
+            <w:proofErr w:type="spellEnd"/>
+            <w:r>
+              <w:rPr>
+                <w:rFonts w:ascii="Times New Roman" w:hAnsi="Times New Roman" w:cs="Times New Roman"/>
+                <w:sz w:val="24"/>
+                <w:szCs w:val="24"/>
+              </w:rPr>
+              <w:t>() }}</w:t>
+            </w:r>
+          </w:p>
+        </w:tc>
+      </w:tr>
+      <w:tr>
+        <w:trPr>
+          <w:trHeight w:val="350"/>
+        </w:trPr>
+        <w:tc>
+          <w:tcPr>
+            <w:tcW w:w="2335" w:type="dxa"/>
+          </w:tcPr>
+          <w:p>
+            <w:pPr>
+              <w:rPr>
+                <w:rFonts w:ascii="Times New Roman" w:hAnsi="Times New Roman" w:cs="Times New Roman"/>
+                <w:b/>
+                <w:bCs/>
+                <w:sz w:val="24"/>
+                <w:szCs w:val="24"/>
+              </w:rPr>
+            </w:pPr>
+            <w:r>
+              <w:rPr>
+                <w:rFonts w:ascii="Times New Roman" w:hAnsi="Times New Roman" w:cs="Times New Roman"/>
+                <w:b/>
+                <w:bCs/>
+                <w:sz w:val="24"/>
+                <w:szCs w:val="24"/>
+              </w:rPr>
+              <w:t>Claimant’s ID/SSN</w:t>
+            </w:r>
+            <w:r>
+              <w:rPr>
+                <w:rFonts w:ascii="Times New Roman" w:hAnsi="Times New Roman" w:cs="Times New Roman"/>
+                <w:b/>
+                <w:bCs/>
+                <w:sz w:val="24"/>
+                <w:szCs w:val="24"/>
+              </w:rPr>
+              <w:t xml:space="preserve">: </w:t>
+            </w:r>
+          </w:p>
+        </w:tc>
+        <w:tc>
+          <w:tcPr>
+            <w:tcW w:w="7015" w:type="dxa"/>
+          </w:tcPr>
+          <w:p>
+            <w:pPr>
+              <w:rPr>
+                <w:rFonts w:ascii="Times New Roman" w:hAnsi="Times New Roman" w:cs="Times New Roman"/>
+                <w:sz w:val="24"/>
+                <w:szCs w:val="24"/>
+              </w:rPr>
+            </w:pPr>
+            <w:proofErr w:type="gramStart"/>
+            <w:r>
+              <w:rPr>
+                <w:rFonts w:ascii="Times New Roman" w:hAnsi="Times New Roman" w:cs="Times New Roman"/>
+                <w:sz w:val="24"/>
+                <w:szCs w:val="24"/>
+              </w:rPr>
+              <w:t>{{ (</w:t>
+            </w:r>
+            <w:proofErr w:type="gramEnd"/>
+            <w:r>
+              <w:rPr>
+                <w:rFonts w:ascii="Times New Roman" w:hAnsi="Times New Roman" w:cs="Times New Roman"/>
+                <w:sz w:val="24"/>
+                <w:szCs w:val="24"/>
+              </w:rPr>
+              <w:t>users[0].</w:t>
+            </w:r>
+            <w:proofErr w:type="spellStart"/>
+            <w:r>
+              <w:rPr>
+                <w:rFonts w:ascii="Times New Roman" w:hAnsi="Times New Roman" w:cs="Times New Roman"/>
+                <w:sz w:val="24"/>
+                <w:szCs w:val="24"/>
+              </w:rPr>
+              <w:t>id_or_ssn|int</w:t>
+            </w:r>
+            <w:proofErr w:type="spellEnd"/>
+            <w:r>
+              <w:rPr>
+                <w:rFonts w:ascii="Times New Roman" w:hAnsi="Times New Roman" w:cs="Times New Roman"/>
+                <w:sz w:val="24"/>
+                <w:szCs w:val="24"/>
+              </w:rPr>
+              <w:t>)|string }}</w:t>
+            </w:r>
+          </w:p>
+        </w:tc>
+      </w:tr>
+      <w:tr>
+        <w:trPr>
+          <w:trHeight w:val="350"/>
+        </w:trPr>
+        <w:tc>
+          <w:tcPr>
+            <w:tcW w:w="2335" w:type="dxa"/>
+          </w:tcPr>
+          <w:p>
+            <w:pPr>
+              <w:rPr>
+                <w:rFonts w:ascii="Times New Roman" w:hAnsi="Times New Roman" w:cs="Times New Roman"/>
+                <w:sz w:val="24"/>
+                <w:szCs w:val="24"/>
+              </w:rPr>
+            </w:pPr>
+            <w:r>
+              <w:rPr>
+                <w:rFonts w:ascii="Times New Roman" w:hAnsi="Times New Roman" w:cs="Times New Roman"/>
+                <w:b/>
+                <w:bCs/>
+                <w:sz w:val="24"/>
+                <w:szCs w:val="24"/>
+              </w:rPr>
+              <w:t>Date Appeal Filed</w:t>
+            </w:r>
+            <w:r>
+              <w:rPr>
+                <w:rFonts w:ascii="Times New Roman" w:hAnsi="Times New Roman" w:cs="Times New Roman"/>
+                <w:b/>
+                <w:bCs/>
+                <w:sz w:val="24"/>
+                <w:szCs w:val="24"/>
+              </w:rPr>
+              <w:t>:</w:t>
+            </w:r>
+          </w:p>
+        </w:tc>
+        <w:tc>
+          <w:tcPr>
+            <w:tcW w:w="7015" w:type="dxa"/>
+          </w:tcPr>
+          <w:p>
+            <w:pPr>
+              <w:rPr>
+                <w:rFonts w:ascii="Times New Roman" w:hAnsi="Times New Roman" w:cs="Times New Roman"/>
+                <w:b/>
+                <w:bCs/>
+                <w:sz w:val="24"/>
+                <w:szCs w:val="24"/>
+              </w:rPr>
+            </w:pPr>
+            <w:proofErr w:type="gramStart"/>
+            <w:r>
+              <w:rPr>
+                <w:rFonts w:ascii="Times New Roman" w:hAnsi="Times New Roman" w:cs="Times New Roman"/>
+                <w:sz w:val="24"/>
+                <w:szCs w:val="24"/>
+              </w:rPr>
+              <w:t xml:space="preserve">{{ </w:t>
+            </w:r>
+            <w:proofErr w:type="spellStart"/>
+            <w:r>
+              <w:rPr>
+                <w:rFonts w:ascii="Times New Roman" w:hAnsi="Times New Roman" w:cs="Times New Roman"/>
+                <w:sz w:val="24"/>
+                <w:szCs w:val="24"/>
+              </w:rPr>
+              <w:t>decision</w:t>
+            </w:r>
+            <w:proofErr w:type="gramEnd"/>
+            <w:r>
+              <w:rPr>
+                <w:rFonts w:ascii="Times New Roman" w:hAnsi="Times New Roman" w:cs="Times New Roman"/>
+                <w:sz w:val="24"/>
+                <w:szCs w:val="24"/>
+              </w:rPr>
+              <w:t>_date.format</w:t>
+            </w:r>
+            <w:proofErr w:type="spellEnd"/>
+            <w:r>
+              <w:rPr>
+                <w:rFonts w:ascii="Times New Roman" w:hAnsi="Times New Roman" w:cs="Times New Roman"/>
+                <w:sz w:val="24"/>
+                <w:szCs w:val="24"/>
+              </w:rPr>
+              <w:t>("MM/dd/</w:t>
+            </w:r>
+            <w:proofErr w:type="spellStart"/>
+            <w:r>
+              <w:rPr>
+                <w:rFonts w:ascii="Times New Roman" w:hAnsi="Times New Roman" w:cs="Times New Roman"/>
+                <w:sz w:val="24"/>
+                <w:szCs w:val="24"/>
+              </w:rPr>
+              <w:t>yyyy</w:t>
+            </w:r>
+            <w:proofErr w:type="spellEnd"/>
+            <w:r>
+              <w:rPr>
+                <w:rFonts w:ascii="Times New Roman" w:hAnsi="Times New Roman" w:cs="Times New Roman"/>
+                <w:sz w:val="24"/>
+                <w:szCs w:val="24"/>
+              </w:rPr>
+              <w:t>") }}</w:t>
+            </w:r>
+          </w:p>
+        </w:tc>
+      </w:tr>
+      <w:tr>
+        <w:trPr>
+          <w:trHeight w:val="350"/>
+        </w:trPr>
+        <w:tc>
+          <w:tcPr>
+            <w:tcW w:w="2335" w:type="dxa"/>
+            <w:tcBorders>
+              <w:bottom w:val="single" w:sz="4" w:space="0" w:color="auto"/>
+            </w:tcBorders>
+          </w:tcPr>
+          <w:p>
+            <w:pPr>
+              <w:rPr>
+                <w:rFonts w:ascii="Times New Roman" w:hAnsi="Times New Roman" w:cs="Times New Roman"/>
+                <w:b/>
+                <w:bCs/>
+                <w:sz w:val="24"/>
+                <w:szCs w:val="24"/>
+              </w:rPr>
+            </w:pPr>
+            <w:r>
+              <w:rPr>
+                <w:rFonts w:ascii="Times New Roman" w:hAnsi="Times New Roman" w:cs="Times New Roman"/>
+                <w:b/>
+                <w:bCs/>
+                <w:sz w:val="24"/>
+                <w:szCs w:val="24"/>
+              </w:rPr>
+              <w:t>Docket #:</w:t>
+            </w:r>
+          </w:p>
+        </w:tc>
+        <w:tc>
+          <w:tcPr>
+            <w:tcW w:w="7015" w:type="dxa"/>
+            <w:tcBorders>
+              <w:bottom w:val="single" w:sz="4" w:space="0" w:color="auto"/>
+            </w:tcBorders>
+          </w:tcPr>
+          <w:p>
+            <w:pPr>
+              <w:rPr>
+                <w:rFonts w:ascii="Times New Roman" w:hAnsi="Times New Roman" w:cs="Times New Roman"/>
+                <w:b/>
+                <w:bCs/>
+                <w:sz w:val="24"/>
+                <w:szCs w:val="24"/>
+              </w:rPr>
+            </w:pPr>
+            <w:proofErr w:type="gramStart"/>
+            <w:r>
+              <w:rPr>
+                <w:rFonts w:ascii="Times New Roman" w:hAnsi="Times New Roman" w:cs="Times New Roman"/>
+                <w:sz w:val="24"/>
+                <w:szCs w:val="24"/>
+              </w:rPr>
+              <w:t xml:space="preserve">{{ </w:t>
+            </w:r>
+            <w:proofErr w:type="spellStart"/>
+            <w:r>
+              <w:rPr>
+                <w:rFonts w:ascii="Times New Roman" w:hAnsi="Times New Roman" w:cs="Times New Roman"/>
+                <w:sz w:val="24"/>
+                <w:szCs w:val="24"/>
+              </w:rPr>
+              <w:t>docket</w:t>
+            </w:r>
+            <w:proofErr w:type="gramEnd"/>
+            <w:r>
+              <w:rPr>
+                <w:rFonts w:ascii="Times New Roman" w:hAnsi="Times New Roman" w:cs="Times New Roman"/>
+                <w:sz w:val="24"/>
+                <w:szCs w:val="24"/>
+              </w:rPr>
+              <w:t>_number</w:t>
+            </w:r>
+            <w:proofErr w:type="spellEnd"/>
+            <w:r>
+              <w:rPr>
+                <w:rFonts w:ascii="Times New Roman" w:hAnsi="Times New Roman" w:cs="Times New Roman"/>
+                <w:sz w:val="24"/>
+                <w:szCs w:val="24"/>
+              </w:rPr>
+              <w:t xml:space="preserve"> }}</w:t>
+            </w:r>
+            <w:r>
+              <w:rPr>
+                <w:rFonts w:ascii="Times New Roman" w:hAnsi="Times New Roman" w:cs="Times New Roman"/>
+                <w:sz w:val="24"/>
+                <w:szCs w:val="24"/>
+              </w:rPr>
+              <w:t xml:space="preserve"> </w:t>
+            </w:r>
+          </w:p>
+        </w:tc>
+      </w:tr>
+    </w:tbl>
     <w:p>
       <w:pPr>
         <w:spacing w:after="0" w:line="240" w:lineRule="auto"/>
-        <w:rPr>
-          <w:rFonts w:ascii="Times New Roman" w:hAnsi="Times New Roman" w:cs="Times New Roman"/>
-          <w:sz w:val="24"/>
-          <w:szCs w:val="24"/>
-        </w:rPr>
-      </w:pPr>
-      <w:r>
-        <w:rPr>
-          <w:rFonts w:ascii="Times New Roman" w:hAnsi="Times New Roman" w:cs="Times New Roman"/>
-          <w:sz w:val="24"/>
-          <w:szCs w:val="24"/>
-        </w:rPr>
-        <w:t>Docket</w:t>
-      </w:r>
-      <w:r>
-        <w:rPr>
-          <w:rFonts w:ascii="Times New Roman" w:hAnsi="Times New Roman" w:cs="Times New Roman"/>
-          <w:sz w:val="24"/>
-          <w:szCs w:val="24"/>
-        </w:rPr>
-        <w:t xml:space="preserve"> #</w:t>
-      </w:r>
-      <w:r>
-        <w:rPr>
-          <w:rFonts w:ascii="Times New Roman" w:hAnsi="Times New Roman" w:cs="Times New Roman"/>
-          <w:sz w:val="24"/>
-          <w:szCs w:val="24"/>
-        </w:rPr>
-        <w:t xml:space="preserve">: </w:t>
-      </w:r>
-      <w:proofErr w:type="gramStart"/>
-      <w:r>
-        <w:rPr>
-          <w:rFonts w:ascii="Times New Roman" w:hAnsi="Times New Roman" w:cs="Times New Roman"/>
-          <w:sz w:val="24"/>
-          <w:szCs w:val="24"/>
-        </w:rPr>
-        <w:t xml:space="preserve">{{ </w:t>
-      </w:r>
-      <w:proofErr w:type="spellStart"/>
-      <w:r>
-        <w:rPr>
-          <w:rFonts w:ascii="Times New Roman" w:hAnsi="Times New Roman" w:cs="Times New Roman"/>
-          <w:sz w:val="24"/>
-          <w:szCs w:val="24"/>
-        </w:rPr>
-        <w:t>docket</w:t>
-      </w:r>
-      <w:proofErr w:type="gramEnd"/>
-      <w:r>
-        <w:rPr>
-          <w:rFonts w:ascii="Times New Roman" w:hAnsi="Times New Roman" w:cs="Times New Roman"/>
-          <w:sz w:val="24"/>
-          <w:szCs w:val="24"/>
-        </w:rPr>
-        <w:t>_number</w:t>
-      </w:r>
-      <w:proofErr w:type="spellEnd"/>
-      <w:r>
-        <w:rPr>
-          <w:rFonts w:ascii="Times New Roman" w:hAnsi="Times New Roman" w:cs="Times New Roman"/>
-          <w:sz w:val="24"/>
-          <w:szCs w:val="24"/>
-        </w:rPr>
-        <w:t xml:space="preserve"> }}</w:t>
-      </w:r>
-    </w:p>
-    <w:p>
-      <w:pPr>
         <w:rPr>
           <w:rFonts w:ascii="Times New Roman" w:hAnsi="Times New Roman" w:cs="Times New Roman"/>
           <w:sz w:val="24"/>
@@ -292,15 +499,7 @@
           <w:sz w:val="24"/>
           <w:szCs w:val="24"/>
         </w:rPr>
-        <w:t xml:space="preserve"> | length &gt;= 2</w:t>
-      </w:r>
-      <w:r>
-        <w:rPr>
-          <w:rFonts w:ascii="Times New Roman" w:hAnsi="Times New Roman" w:cs="Times New Roman"/>
-          <w:sz w:val="24"/>
-          <w:szCs w:val="24"/>
-        </w:rPr>
-        <w:t xml:space="preserve"> %}</w:t>
+        <w:t xml:space="preserve"> | length &gt; 2 %}</w:t>
       </w:r>
     </w:p>
     <w:p>
@@ -410,7 +609,7 @@
     </w:p>
     <w:p>
       <w:pPr>
-        <w:spacing w:after="0" w:line="240" w:lineRule="auto"/>
+        <w:spacing w:after="0"/>
         <w:rPr>
           <w:rFonts w:ascii="Times New Roman" w:hAnsi="Times New Roman" w:cs="Times New Roman"/>
           <w:sz w:val="24"/>
@@ -459,7 +658,23 @@
           <w:sz w:val="24"/>
           <w:szCs w:val="24"/>
         </w:rPr>
-        <w:t xml:space="preserve">{%p </w:t>
+        <w:t>{%</w:t>
+      </w:r>
+      <w:r>
+        <w:rPr>
+          <w:rFonts w:ascii="Times New Roman" w:hAnsi="Times New Roman" w:cs="Times New Roman"/>
+          <w:sz w:val="24"/>
+          <w:szCs w:val="24"/>
+        </w:rPr>
+        <w:t>p</w:t>
+      </w:r>
+      <w:r>
+        <w:rPr>
+          <w:rFonts w:ascii="Times New Roman" w:hAnsi="Times New Roman" w:cs="Times New Roman"/>
+          <w:sz w:val="24"/>
+          <w:szCs w:val="24"/>
+        </w:rPr>
+        <w:t xml:space="preserve"> </w:t>
       </w:r>
       <w:r>
         <w:rPr>
@@ -475,7 +690,15 @@
           <w:sz w:val="24"/>
           <w:szCs w:val="24"/>
         </w:rPr>
-        <w:t xml:space="preserve"> %}</w:t>
+        <w:t xml:space="preserve"> %</w:t>
+      </w:r>
+      <w:r>
+        <w:rPr>
+          <w:rFonts w:ascii="Times New Roman" w:hAnsi="Times New Roman" w:cs="Times New Roman"/>
+          <w:sz w:val="24"/>
+          <w:szCs w:val="24"/>
+        </w:rPr>
+        <w:t>}</w:t>
       </w:r>
     </w:p>
     <w:p>
@@ -488,156 +711,143 @@
         </w:rPr>
       </w:pPr>
     </w:p>
-    <w:p>
-      <w:pPr>
-        <w:spacing w:after="0" w:line="240" w:lineRule="auto"/>
-        <w:rPr>
-          <w:rFonts w:ascii="Times New Roman" w:hAnsi="Times New Roman" w:cs="Times New Roman"/>
-          <w:sz w:val="24"/>
-          <w:szCs w:val="24"/>
-        </w:rPr>
-      </w:pPr>
-      <w:r>
-        <w:rPr>
-          <w:rFonts w:ascii="Times New Roman" w:hAnsi="Times New Roman" w:cs="Times New Roman"/>
-          <w:sz w:val="24"/>
-          <w:szCs w:val="24"/>
-        </w:rPr>
-        <w:t xml:space="preserve">{%p if </w:t>
-      </w:r>
-      <w:proofErr w:type="spellStart"/>
-      <w:r>
-        <w:rPr>
-          <w:rFonts w:ascii="Times New Roman" w:hAnsi="Times New Roman" w:cs="Times New Roman"/>
-          <w:sz w:val="24"/>
-          <w:szCs w:val="24"/>
-        </w:rPr>
-        <w:t>appeal_reason</w:t>
-      </w:r>
-      <w:proofErr w:type="spellEnd"/>
-      <w:r>
-        <w:rPr>
-          <w:rFonts w:ascii="Times New Roman" w:hAnsi="Times New Roman" w:cs="Times New Roman"/>
-          <w:sz w:val="24"/>
-          <w:szCs w:val="24"/>
-        </w:rPr>
-        <w:t xml:space="preserve"> | length &gt; 600 %}</w:t>
-      </w:r>
-    </w:p>
-    <w:p>
-      <w:pPr>
-        <w:spacing w:after="0"/>
-        <w:rPr>
-          <w:rFonts w:ascii="Times New Roman" w:hAnsi="Times New Roman" w:cs="Times New Roman"/>
-          <w:sz w:val="24"/>
-          <w:szCs w:val="24"/>
-        </w:rPr>
-      </w:pPr>
-      <w:r>
-        <w:rPr>
-          <w:rFonts w:ascii="Times New Roman" w:hAnsi="Times New Roman" w:cs="Times New Roman"/>
-          <w:sz w:val="24"/>
-          <w:szCs w:val="24"/>
-        </w:rPr>
-        <w:t>I disagree with the decision for the following reasons:</w:t>
-      </w:r>
-    </w:p>
-    <w:p>
-      <w:pPr>
-        <w:spacing w:after="0" w:line="240" w:lineRule="auto"/>
-        <w:rPr>
-          <w:rFonts w:ascii="Times New Roman" w:hAnsi="Times New Roman" w:cs="Times New Roman"/>
-          <w:sz w:val="24"/>
-          <w:szCs w:val="24"/>
-        </w:rPr>
-      </w:pPr>
-      <w:proofErr w:type="gramStart"/>
-      <w:r>
-        <w:rPr>
-          <w:rFonts w:ascii="Times New Roman" w:hAnsi="Times New Roman" w:cs="Times New Roman"/>
-          <w:sz w:val="24"/>
-          <w:szCs w:val="24"/>
-        </w:rPr>
-        <w:t>{</w:t>
-      </w:r>
-      <w:r>
-        <w:rPr>
-          <w:rFonts w:ascii="Times New Roman" w:hAnsi="Times New Roman" w:cs="Times New Roman"/>
-          <w:sz w:val="24"/>
-          <w:szCs w:val="24"/>
-        </w:rPr>
-        <w:t xml:space="preserve">{ </w:t>
-      </w:r>
-      <w:proofErr w:type="spellStart"/>
-      <w:r>
-        <w:rPr>
-          <w:rFonts w:ascii="Times New Roman" w:hAnsi="Times New Roman" w:cs="Times New Roman"/>
-          <w:sz w:val="24"/>
-          <w:szCs w:val="24"/>
-        </w:rPr>
-        <w:t>appeal</w:t>
-      </w:r>
-      <w:proofErr w:type="gramEnd"/>
-      <w:r>
-        <w:rPr>
-          <w:rFonts w:ascii="Times New Roman" w:hAnsi="Times New Roman" w:cs="Times New Roman"/>
-          <w:sz w:val="24"/>
-          <w:szCs w:val="24"/>
-        </w:rPr>
-        <w:t>_reason</w:t>
-      </w:r>
-      <w:proofErr w:type="spellEnd"/>
-      <w:r>
-        <w:rPr>
-          <w:rFonts w:ascii="Times New Roman" w:hAnsi="Times New Roman" w:cs="Times New Roman"/>
-          <w:sz w:val="24"/>
-          <w:szCs w:val="24"/>
-        </w:rPr>
-        <w:t xml:space="preserve"> }}</w:t>
-      </w:r>
-    </w:p>
-    <w:p>
-      <w:pPr>
-        <w:spacing w:after="0" w:line="240" w:lineRule="auto"/>
-        <w:rPr>
-          <w:rFonts w:ascii="Times New Roman" w:hAnsi="Times New Roman" w:cs="Times New Roman"/>
-          <w:sz w:val="24"/>
-          <w:szCs w:val="24"/>
-        </w:rPr>
-      </w:pPr>
-      <w:r>
-        <w:rPr>
-          <w:rFonts w:ascii="Times New Roman" w:hAnsi="Times New Roman" w:cs="Times New Roman"/>
-          <w:sz w:val="24"/>
-          <w:szCs w:val="24"/>
-        </w:rPr>
-        <w:t xml:space="preserve">{%p </w:t>
-      </w:r>
-      <w:r>
-        <w:rPr>
-          <w:rFonts w:ascii="Times New Roman" w:hAnsi="Times New Roman" w:cs="Times New Roman"/>
-          <w:sz w:val="24"/>
-          <w:szCs w:val="24"/>
-        </w:rPr>
-        <w:t>endif</w:t>
-      </w:r>
-      <w:r>
-        <w:rPr>
-          <w:rFonts w:ascii="Times New Roman" w:hAnsi="Times New Roman" w:cs="Times New Roman"/>
-          <w:sz w:val="24"/>
-          <w:szCs w:val="24"/>
-        </w:rPr>
-        <w:t xml:space="preserve"> </w:t>
-      </w:r>
-      <w:r>
-        <w:rPr>
-          <w:rFonts w:ascii="Times New Roman" w:hAnsi="Times New Roman" w:cs="Times New Roman"/>
-          <w:sz w:val="24"/>
-          <w:szCs w:val="24"/>
-        </w:rPr>
-        <w:t>%}</w:t>
-      </w:r>
-    </w:p>
+    <w:tbl>
+      <w:tblPr>
+        <w:tblStyle w:val="TableGrid"/>
+        <w:tblW w:w="0" w:type="auto"/>
+        <w:tblInd w:w="-5" w:type="dxa"/>
+        <w:tblLook w:val="04A0" w:firstRow="1" w:lastRow="0" w:firstColumn="1" w:lastColumn="0" w:noHBand="0" w:noVBand="1"/>
+      </w:tblPr>
+      <w:tblGrid>
+        <w:gridCol w:w="9350"/>
+      </w:tblGrid>
+      <w:tr>
+        <w:trPr>
+          <w:trHeight w:val="233"/>
+        </w:trPr>
+        <w:tc>
+          <w:tcPr>
+            <w:tcW w:w="9350" w:type="dxa"/>
+            <w:tcBorders>
+              <w:top w:val="single" w:sz="4" w:space="0" w:color="auto"/>
+            </w:tcBorders>
+          </w:tcPr>
+          <w:p>
+            <w:pPr>
+              <w:rPr>
+                <w:rFonts w:ascii="Times New Roman" w:hAnsi="Times New Roman" w:cs="Times New Roman"/>
+                <w:sz w:val="24"/>
+                <w:szCs w:val="24"/>
+              </w:rPr>
+            </w:pPr>
+            <w:r>
+              <w:rPr>
+                <w:rFonts w:ascii="Times New Roman" w:hAnsi="Times New Roman" w:cs="Times New Roman"/>
+                <w:sz w:val="24"/>
+                <w:szCs w:val="24"/>
+              </w:rPr>
+              <w:t xml:space="preserve">{%p if </w:t>
+            </w:r>
+            <w:proofErr w:type="spellStart"/>
+            <w:r>
+              <w:rPr>
+                <w:rFonts w:ascii="Times New Roman" w:hAnsi="Times New Roman" w:cs="Times New Roman"/>
+                <w:sz w:val="24"/>
+                <w:szCs w:val="24"/>
+              </w:rPr>
+              <w:t>appeal_reason_formatted</w:t>
+            </w:r>
+            <w:proofErr w:type="spellEnd"/>
+            <w:r>
+              <w:rPr>
+                <w:rFonts w:ascii="Times New Roman" w:hAnsi="Times New Roman" w:cs="Times New Roman"/>
+                <w:sz w:val="24"/>
+                <w:szCs w:val="24"/>
+              </w:rPr>
+              <w:t xml:space="preserve"> | length &gt; 800 %}</w:t>
+            </w:r>
+          </w:p>
+          <w:p>
+            <w:pPr>
+              <w:rPr>
+                <w:rFonts w:ascii="Times New Roman" w:hAnsi="Times New Roman" w:cs="Times New Roman"/>
+                <w:sz w:val="24"/>
+                <w:szCs w:val="24"/>
+              </w:rPr>
+            </w:pPr>
+            <w:proofErr w:type="gramStart"/>
+            <w:r>
+              <w:rPr>
+                <w:rFonts w:ascii="Times New Roman" w:hAnsi="Times New Roman" w:cs="Times New Roman"/>
+                <w:sz w:val="24"/>
+                <w:szCs w:val="24"/>
+              </w:rPr>
+              <w:t>{</w:t>
+            </w:r>
+            <w:r>
+              <w:rPr>
+                <w:rFonts w:ascii="Times New Roman" w:hAnsi="Times New Roman" w:cs="Times New Roman"/>
+                <w:sz w:val="24"/>
+                <w:szCs w:val="24"/>
+              </w:rPr>
+              <w:t xml:space="preserve">{ </w:t>
+            </w:r>
+            <w:proofErr w:type="spellStart"/>
+            <w:r>
+              <w:rPr>
+                <w:rFonts w:ascii="Times New Roman" w:hAnsi="Times New Roman" w:cs="Times New Roman"/>
+                <w:sz w:val="24"/>
+                <w:szCs w:val="24"/>
+              </w:rPr>
+              <w:t>appeal</w:t>
+            </w:r>
+            <w:proofErr w:type="gramEnd"/>
+            <w:r>
+              <w:rPr>
+                <w:rFonts w:ascii="Times New Roman" w:hAnsi="Times New Roman" w:cs="Times New Roman"/>
+                <w:sz w:val="24"/>
+                <w:szCs w:val="24"/>
+              </w:rPr>
+              <w:t>_reason_formatted</w:t>
+            </w:r>
+            <w:proofErr w:type="spellEnd"/>
+            <w:r>
+              <w:rPr>
+                <w:rFonts w:ascii="Times New Roman" w:hAnsi="Times New Roman" w:cs="Times New Roman"/>
+                <w:sz w:val="24"/>
+                <w:szCs w:val="24"/>
+              </w:rPr>
+              <w:t xml:space="preserve"> </w:t>
+            </w:r>
+            <w:r>
+              <w:rPr>
+                <w:rFonts w:ascii="Times New Roman" w:hAnsi="Times New Roman" w:cs="Times New Roman"/>
+                <w:sz w:val="24"/>
+                <w:szCs w:val="24"/>
+              </w:rPr>
+              <w:t>}}</w:t>
+            </w:r>
+          </w:p>
+          <w:p>
+            <w:pPr>
+              <w:rPr>
+                <w:rFonts w:ascii="Times New Roman" w:hAnsi="Times New Roman" w:cs="Times New Roman"/>
+                <w:sz w:val="24"/>
+                <w:szCs w:val="24"/>
+              </w:rPr>
+            </w:pPr>
+            <w:r>
+              <w:rPr>
+                <w:rFonts w:ascii="Times New Roman" w:hAnsi="Times New Roman" w:cs="Times New Roman"/>
+                <w:sz w:val="24"/>
+                <w:szCs w:val="24"/>
+              </w:rPr>
+              <w:t>{% endif %}</w:t>
+            </w:r>
+          </w:p>
+        </w:tc>
+      </w:tr>
+    </w:tbl>
     <w:p>
       <w:pPr>
         <w:spacing w:after="0" w:line="240" w:lineRule="auto"/>
@@ -1383,7 +1593,6 @@
   <w:style w:type="character" w:default="1" w:styleId="DefaultParagraphFont">
     <w:name w:val="Default Paragraph Font"/>
     <w:uiPriority w:val="1"/>
-    <w:semiHidden/>
     <w:unhideWhenUsed/>
   </w:style>
   <w:style w:type="table" w:default="1" w:styleId="TableNormal">
@@ -1696,6 +1905,25 @@
       <w:color w:val="2E74B5" w:themeColor="accent1" w:themeShade="BF"/>
       <w:spacing w:val="5"/>
     </w:rPr>
+  </w:style>
+  <w:style w:type="table" w:styleId="TableGrid">
+    <w:name w:val="Table Grid"/>
+    <w:basedOn w:val="TableNormal"/>
+    <w:uiPriority w:val="39"/>
+    <w:rsid w:val="00384691"/>
+    <w:pPr>
+      <w:spacing w:after="0" w:line="240" w:lineRule="auto"/>
+    </w:pPr>
+    <w:tblPr>
+      <w:tblBorders>
+        <w:top w:val="single" w:sz="4" w:space="0" w:color="auto"/>
+        <w:left w:val="single" w:sz="4" w:space="0" w:color="auto"/>
+        <w:bottom w:val="single" w:sz="4" w:space="0" w:color="auto"/>
+        <w:right w:val="single" w:sz="4" w:space="0" w:color="auto"/>
+        <w:insideH w:val="single" w:sz="4" w:space="0" w:color="auto"/>
+        <w:insideV w:val="single" w:sz="4" w:space="0" w:color="auto"/>
+      </w:tblBorders>
+    </w:tblPr>
   </w:style>
 </w:styles>
 </file>

</xml_diff>

<commit_message>
Updates to changes to the appeal reason block if review modifies it and updated PDF/DOCX files.
</commit_message>
<xml_diff>
--- a/docassemble/UIAppealAfterHearing/data/templates/additional_attachments.docx
+++ b/docassemble/UIAppealAfterHearing/data/templates/additional_attachments.docx
@@ -110,23 +110,13 @@
                 <w:szCs w:val="24"/>
               </w:rPr>
             </w:pPr>
-            <w:proofErr w:type="gramStart"/>
-            <w:r>
-              <w:rPr>
-                <w:rFonts w:ascii="Times New Roman" w:hAnsi="Times New Roman" w:cs="Times New Roman"/>
-                <w:sz w:val="24"/>
-                <w:szCs w:val="24"/>
-              </w:rPr>
-              <w:t>{{ users</w:t>
-            </w:r>
-            <w:proofErr w:type="gramEnd"/>
-            <w:r>
-              <w:rPr>
-                <w:rFonts w:ascii="Times New Roman" w:hAnsi="Times New Roman" w:cs="Times New Roman"/>
-                <w:sz w:val="24"/>
-                <w:szCs w:val="24"/>
-              </w:rPr>
-              <w:t>[0].</w:t>
+            <w:r>
+              <w:rPr>
+                <w:rFonts w:ascii="Times New Roman" w:hAnsi="Times New Roman" w:cs="Times New Roman"/>
+                <w:sz w:val="24"/>
+                <w:szCs w:val="24"/>
+              </w:rPr>
+              <w:t>{{ users[0].</w:t>
             </w:r>
             <w:proofErr w:type="spellStart"/>
             <w:r>
@@ -201,23 +191,13 @@
                 <w:szCs w:val="24"/>
               </w:rPr>
             </w:pPr>
-            <w:proofErr w:type="gramStart"/>
-            <w:r>
-              <w:rPr>
-                <w:rFonts w:ascii="Times New Roman" w:hAnsi="Times New Roman" w:cs="Times New Roman"/>
-                <w:sz w:val="24"/>
-                <w:szCs w:val="24"/>
-              </w:rPr>
-              <w:t>{{ (</w:t>
-            </w:r>
-            <w:proofErr w:type="gramEnd"/>
-            <w:r>
-              <w:rPr>
-                <w:rFonts w:ascii="Times New Roman" w:hAnsi="Times New Roman" w:cs="Times New Roman"/>
-                <w:sz w:val="24"/>
-                <w:szCs w:val="24"/>
-              </w:rPr>
-              <w:t>users[0].</w:t>
+            <w:r>
+              <w:rPr>
+                <w:rFonts w:ascii="Times New Roman" w:hAnsi="Times New Roman" w:cs="Times New Roman"/>
+                <w:sz w:val="24"/>
+                <w:szCs w:val="24"/>
+              </w:rPr>
+              <w:t>{{ (users[0].</w:t>
             </w:r>
             <w:proofErr w:type="spellStart"/>
             <w:r>
@@ -264,17 +244,7 @@
                 <w:sz w:val="24"/>
                 <w:szCs w:val="24"/>
               </w:rPr>
-              <w:t>Date Appeal Filed</w:t>
-            </w:r>
-            <w:r>
-              <w:rPr>
-                <w:rFonts w:ascii="Times New Roman" w:hAnsi="Times New Roman" w:cs="Times New Roman"/>
-                <w:b/>
-                <w:bCs/>
-                <w:sz w:val="24"/>
-                <w:szCs w:val="24"/>
-              </w:rPr>
-              <w:t>:</w:t>
+              <w:t>Date Appeal Filed:</w:t>
             </w:r>
           </w:p>
         </w:tc>
@@ -292,7 +262,6 @@
                 <w:szCs w:val="24"/>
               </w:rPr>
             </w:pPr>
-            <w:proofErr w:type="gramStart"/>
             <w:r>
               <w:rPr>
                 <w:rFonts w:ascii="Times New Roman" w:hAnsi="Times New Roman" w:cs="Times New Roman"/>
@@ -308,16 +277,7 @@
                 <w:sz w:val="24"/>
                 <w:szCs w:val="24"/>
               </w:rPr>
-              <w:t>decision</w:t>
-            </w:r>
-            <w:proofErr w:type="gramEnd"/>
-            <w:r>
-              <w:rPr>
-                <w:rFonts w:ascii="Times New Roman" w:hAnsi="Times New Roman" w:cs="Times New Roman"/>
-                <w:sz w:val="24"/>
-                <w:szCs w:val="24"/>
-              </w:rPr>
-              <w:t>_date.format</w:t>
+              <w:t>appeal_date</w:t>
             </w:r>
             <w:proofErr w:type="spellEnd"/>
             <w:r>
@@ -326,25 +286,15 @@
                 <w:sz w:val="24"/>
                 <w:szCs w:val="24"/>
               </w:rPr>
-              <w:t>("MM/dd/</w:t>
-            </w:r>
-            <w:proofErr w:type="spellStart"/>
-            <w:r>
-              <w:rPr>
-                <w:rFonts w:ascii="Times New Roman" w:hAnsi="Times New Roman" w:cs="Times New Roman"/>
-                <w:sz w:val="24"/>
-                <w:szCs w:val="24"/>
-              </w:rPr>
-              <w:t>yyyy</w:t>
-            </w:r>
-            <w:proofErr w:type="spellEnd"/>
-            <w:r>
-              <w:rPr>
-                <w:rFonts w:ascii="Times New Roman" w:hAnsi="Times New Roman" w:cs="Times New Roman"/>
-                <w:sz w:val="24"/>
-                <w:szCs w:val="24"/>
-              </w:rPr>
-              <w:t>") }}</w:t>
+              <w:t xml:space="preserve"> </w:t>
+            </w:r>
+            <w:r>
+              <w:rPr>
+                <w:rFonts w:ascii="Times New Roman" w:hAnsi="Times New Roman" w:cs="Times New Roman"/>
+                <w:sz w:val="24"/>
+                <w:szCs w:val="24"/>
+              </w:rPr>
+              <w:t>}}</w:t>
             </w:r>
           </w:p>
         </w:tc>
@@ -399,7 +349,6 @@
                 <w:szCs w:val="24"/>
               </w:rPr>
             </w:pPr>
-            <w:proofErr w:type="gramStart"/>
             <w:r>
               <w:rPr>
                 <w:rFonts w:ascii="Times New Roman" w:hAnsi="Times New Roman" w:cs="Times New Roman"/>
@@ -415,16 +364,7 @@
                 <w:sz w:val="24"/>
                 <w:szCs w:val="24"/>
               </w:rPr>
-              <w:t>docket</w:t>
-            </w:r>
-            <w:proofErr w:type="gramEnd"/>
-            <w:r>
-              <w:rPr>
-                <w:rFonts w:ascii="Times New Roman" w:hAnsi="Times New Roman" w:cs="Times New Roman"/>
-                <w:sz w:val="24"/>
-                <w:szCs w:val="24"/>
-              </w:rPr>
-              <w:t>_number</w:t>
+              <w:t>docket_number</w:t>
             </w:r>
             <w:proofErr w:type="spellEnd"/>
             <w:r>
@@ -552,7 +492,6 @@
           <w:szCs w:val="24"/>
         </w:rPr>
       </w:pPr>
-      <w:proofErr w:type="gramStart"/>
       <w:r>
         <w:rPr>
           <w:rFonts w:ascii="Times New Roman" w:hAnsi="Times New Roman" w:cs="Times New Roman"/>
@@ -568,16 +507,7 @@
           <w:sz w:val="24"/>
           <w:szCs w:val="24"/>
         </w:rPr>
-        <w:t>doc.name</w:t>
-      </w:r>
-      <w:proofErr w:type="gramEnd"/>
-      <w:r>
-        <w:rPr>
-          <w:rFonts w:ascii="Times New Roman" w:hAnsi="Times New Roman" w:cs="Times New Roman"/>
-          <w:sz w:val="24"/>
-          <w:szCs w:val="24"/>
-        </w:rPr>
-        <w:t>.text</w:t>
+        <w:t>doc.name.text</w:t>
       </w:r>
       <w:proofErr w:type="spellEnd"/>
       <w:r>
@@ -775,7 +705,6 @@
                 <w:szCs w:val="24"/>
               </w:rPr>
             </w:pPr>
-            <w:proofErr w:type="gramStart"/>
             <w:r>
               <w:rPr>
                 <w:rFonts w:ascii="Times New Roman" w:hAnsi="Times New Roman" w:cs="Times New Roman"/>
@@ -799,16 +728,7 @@
                 <w:sz w:val="24"/>
                 <w:szCs w:val="24"/>
               </w:rPr>
-              <w:t>appeal</w:t>
-            </w:r>
-            <w:proofErr w:type="gramEnd"/>
-            <w:r>
-              <w:rPr>
-                <w:rFonts w:ascii="Times New Roman" w:hAnsi="Times New Roman" w:cs="Times New Roman"/>
-                <w:sz w:val="24"/>
-                <w:szCs w:val="24"/>
-              </w:rPr>
-              <w:t>_reason_formatted</w:t>
+              <w:t>appeal_reason_formatted</w:t>
             </w:r>
             <w:proofErr w:type="spellEnd"/>
             <w:r>
@@ -1593,6 +1513,7 @@
   <w:style w:type="character" w:default="1" w:styleId="DefaultParagraphFont">
     <w:name w:val="Default Paragraph Font"/>
     <w:uiPriority w:val="1"/>
+    <w:semiHidden/>
     <w:unhideWhenUsed/>
   </w:style>
   <w:style w:type="table" w:default="1" w:styleId="TableNormal">

</xml_diff>

<commit_message>
additional interview and form updates
</commit_message>
<xml_diff>
--- a/docassemble/UIAppealAfterHearing/data/templates/additional_attachments.docx
+++ b/docassemble/UIAppealAfterHearing/data/templates/additional_attachments.docx
@@ -1,6 +1,6 @@
 
 <file path=word/document.xml><?xml version="1.0" encoding="utf-8"?>
-<w:document xmlns:wpc="http://schemas.microsoft.com/office/word/2010/wordprocessingCanvas" xmlns:cx="http://schemas.microsoft.com/office/drawing/2014/chartex" xmlns:cx1="http://schemas.microsoft.com/office/drawing/2015/9/8/chartex" xmlns:cx2="http://schemas.microsoft.com/office/drawing/2015/10/21/chartex" xmlns:cx3="http://schemas.microsoft.com/office/drawing/2016/5/9/chartex" xmlns:cx4="http://schemas.microsoft.com/office/drawing/2016/5/10/chartex" xmlns:cx5="http://schemas.microsoft.com/office/drawing/2016/5/11/chartex" xmlns:cx6="http://schemas.microsoft.com/office/drawing/2016/5/12/chartex" xmlns:cx7="http://schemas.microsoft.com/office/drawing/2016/5/13/chartex" xmlns:cx8="http://schemas.microsoft.com/office/drawing/2016/5/14/chartex" xmlns:mc="http://schemas.openxmlformats.org/markup-compatibility/2006" xmlns:aink="http://schemas.microsoft.com/office/drawing/2016/ink" xmlns:am3d="http://schemas.microsoft.com/office/drawing/2017/model3d" xmlns:o="urn:schemas-microsoft-com:office:office" xmlns:oel="http://schemas.microsoft.com/office/2019/extlst" xmlns:r="http://schemas.openxmlformats.org/officeDocument/2006/relationships" xmlns:m="http://schemas.openxmlformats.org/officeDocument/2006/math" xmlns:v="urn:schemas-microsoft-com:vml" xmlns:wp14="http://schemas.microsoft.com/office/word/2010/wordprocessingDrawing" xmlns:wp="http://schemas.openxmlformats.org/drawingml/2006/wordprocessingDrawing" xmlns:w10="urn:schemas-microsoft-com:office:word" xmlns:w="http://schemas.openxmlformats.org/wordprocessingml/2006/main" xmlns:w14="http://schemas.microsoft.com/office/word/2010/wordml" xmlns:w15="http://schemas.microsoft.com/office/word/2012/wordml" xmlns:w16cex="http://schemas.microsoft.com/office/word/2018/wordml/cex" xmlns:w16cid="http://schemas.microsoft.com/office/word/2016/wordml/cid" xmlns:w16="http://schemas.microsoft.com/office/word/2018/wordml" xmlns:w16sdtdh="http://schemas.microsoft.com/office/word/2020/wordml/sdtdatahash" xmlns:w16se="http://schemas.microsoft.com/office/word/2015/wordml/symex" xmlns:wpg="http://schemas.microsoft.com/office/word/2010/wordprocessingGroup" xmlns:wpi="http://schemas.microsoft.com/office/word/2010/wordprocessingInk" xmlns:wne="http://schemas.microsoft.com/office/word/2006/wordml" xmlns:wps="http://schemas.microsoft.com/office/word/2010/wordprocessingShape" mc:Ignorable="w14 w15 w16se w16cid w16 w16cex w16sdtdh wp14">
+<w:document xmlns:wpc="http://schemas.microsoft.com/office/word/2010/wordprocessingCanvas" xmlns:cx="http://schemas.microsoft.com/office/drawing/2014/chartex" xmlns:cx1="http://schemas.microsoft.com/office/drawing/2015/9/8/chartex" xmlns:cx2="http://schemas.microsoft.com/office/drawing/2015/10/21/chartex" xmlns:cx3="http://schemas.microsoft.com/office/drawing/2016/5/9/chartex" xmlns:cx4="http://schemas.microsoft.com/office/drawing/2016/5/10/chartex" xmlns:cx5="http://schemas.microsoft.com/office/drawing/2016/5/11/chartex" xmlns:cx6="http://schemas.microsoft.com/office/drawing/2016/5/12/chartex" xmlns:cx7="http://schemas.microsoft.com/office/drawing/2016/5/13/chartex" xmlns:cx8="http://schemas.microsoft.com/office/drawing/2016/5/14/chartex" xmlns:mc="http://schemas.openxmlformats.org/markup-compatibility/2006" xmlns:aink="http://schemas.microsoft.com/office/drawing/2016/ink" xmlns:am3d="http://schemas.microsoft.com/office/drawing/2017/model3d" xmlns:o="urn:schemas-microsoft-com:office:office" xmlns:oel="http://schemas.microsoft.com/office/2019/extlst" xmlns:r="http://schemas.openxmlformats.org/officeDocument/2006/relationships" xmlns:m="http://schemas.openxmlformats.org/officeDocument/2006/math" xmlns:v="urn:schemas-microsoft-com:vml" xmlns:wp14="http://schemas.microsoft.com/office/word/2010/wordprocessingDrawing" xmlns:wp="http://schemas.openxmlformats.org/drawingml/2006/wordprocessingDrawing" xmlns:w10="urn:schemas-microsoft-com:office:word" xmlns:w="http://schemas.openxmlformats.org/wordprocessingml/2006/main" xmlns:w14="http://schemas.microsoft.com/office/word/2010/wordml" xmlns:w15="http://schemas.microsoft.com/office/word/2012/wordml" xmlns:w16cex="http://schemas.microsoft.com/office/word/2018/wordml/cex" xmlns:w16cid="http://schemas.microsoft.com/office/word/2016/wordml/cid" xmlns:w16="http://schemas.microsoft.com/office/word/2018/wordml" xmlns:w16du="http://schemas.microsoft.com/office/word/2023/wordml/word16du" xmlns:w16sdtdh="http://schemas.microsoft.com/office/word/2020/wordml/sdtdatahash" xmlns:w16sdtfl="http://schemas.microsoft.com/office/word/2024/wordml/sdtformatlock" xmlns:w16se="http://schemas.microsoft.com/office/word/2015/wordml/symex" xmlns:wpg="http://schemas.microsoft.com/office/word/2010/wordprocessingGroup" xmlns:wpi="http://schemas.microsoft.com/office/word/2010/wordprocessingInk" xmlns:wne="http://schemas.microsoft.com/office/word/2006/wordml" xmlns:wps="http://schemas.microsoft.com/office/word/2010/wordprocessingShape" mc:Ignorable="w14 w15 w16se w16cid w16 w16cex w16sdtdh w16sdtfl w16du wp14">
   <w:body>
     <w:p>
       <w:pPr>
@@ -92,7 +92,27 @@
                 <w:sz w:val="24"/>
                 <w:szCs w:val="24"/>
               </w:rPr>
-              <w:t>Name of Applicant:</w:t>
+              <w:t>Name of App</w:t>
+            </w:r>
+            <w:r>
+              <w:rPr>
+                <w:rFonts w:ascii="Times New Roman" w:hAnsi="Times New Roman" w:cs="Times New Roman"/>
+                <w:b/>
+                <w:bCs/>
+                <w:sz w:val="24"/>
+                <w:szCs w:val="24"/>
+              </w:rPr>
+              <w:t>ellan</w:t>
+            </w:r>
+            <w:r>
+              <w:rPr>
+                <w:rFonts w:ascii="Times New Roman" w:hAnsi="Times New Roman" w:cs="Times New Roman"/>
+                <w:b/>
+                <w:bCs/>
+                <w:sz w:val="24"/>
+                <w:szCs w:val="24"/>
+              </w:rPr>
+              <w:t>t:</w:t>
             </w:r>
           </w:p>
         </w:tc>
@@ -116,25 +136,7 @@
                 <w:sz w:val="24"/>
                 <w:szCs w:val="24"/>
               </w:rPr>
-              <w:t>{{ users[0].</w:t>
-            </w:r>
-            <w:proofErr w:type="spellStart"/>
-            <w:r>
-              <w:rPr>
-                <w:rFonts w:ascii="Times New Roman" w:hAnsi="Times New Roman" w:cs="Times New Roman"/>
-                <w:sz w:val="24"/>
-                <w:szCs w:val="24"/>
-              </w:rPr>
-              <w:t>name_full</w:t>
-            </w:r>
-            <w:proofErr w:type="spellEnd"/>
-            <w:r>
-              <w:rPr>
-                <w:rFonts w:ascii="Times New Roman" w:hAnsi="Times New Roman" w:cs="Times New Roman"/>
-                <w:sz w:val="24"/>
-                <w:szCs w:val="24"/>
-              </w:rPr>
-              <w:t>() }}</w:t>
+              <w:t>{{ users[0].name_full() }}</w:t>
             </w:r>
           </w:p>
         </w:tc>
@@ -165,7 +167,17 @@
                 <w:sz w:val="24"/>
                 <w:szCs w:val="24"/>
               </w:rPr>
-              <w:t>Claimant’s ID/SSN</w:t>
+              <w:t>Claimant’s ID/SS</w:t>
+            </w:r>
+            <w:r>
+              <w:rPr>
+                <w:rFonts w:ascii="Times New Roman" w:hAnsi="Times New Roman" w:cs="Times New Roman"/>
+                <w:b/>
+                <w:bCs/>
+                <w:sz w:val="24"/>
+                <w:szCs w:val="24"/>
+              </w:rPr>
+              <w:t>#</w:t>
             </w:r>
             <w:r>
               <w:rPr>
@@ -197,25 +209,7 @@
                 <w:sz w:val="24"/>
                 <w:szCs w:val="24"/>
               </w:rPr>
-              <w:t>{{ (users[0].</w:t>
-            </w:r>
-            <w:proofErr w:type="spellStart"/>
-            <w:r>
-              <w:rPr>
-                <w:rFonts w:ascii="Times New Roman" w:hAnsi="Times New Roman" w:cs="Times New Roman"/>
-                <w:sz w:val="24"/>
-                <w:szCs w:val="24"/>
-              </w:rPr>
-              <w:t>id_or_ssn|int</w:t>
-            </w:r>
-            <w:proofErr w:type="spellEnd"/>
-            <w:r>
-              <w:rPr>
-                <w:rFonts w:ascii="Times New Roman" w:hAnsi="Times New Roman" w:cs="Times New Roman"/>
-                <w:sz w:val="24"/>
-                <w:szCs w:val="24"/>
-              </w:rPr>
-              <w:t>)|string }}</w:t>
+              <w:t>{{ (users[0].id_or_ssn|int)|string }}</w:t>
             </w:r>
           </w:p>
         </w:tc>
@@ -270,7 +264,6 @@
               </w:rPr>
               <w:t xml:space="preserve">{{ </w:t>
             </w:r>
-            <w:proofErr w:type="spellStart"/>
             <w:r>
               <w:rPr>
                 <w:rFonts w:ascii="Times New Roman" w:hAnsi="Times New Roman" w:cs="Times New Roman"/>
@@ -279,7 +272,6 @@
               </w:rPr>
               <w:t>appeal_date</w:t>
             </w:r>
-            <w:proofErr w:type="spellEnd"/>
             <w:r>
               <w:rPr>
                 <w:rFonts w:ascii="Times New Roman" w:hAnsi="Times New Roman" w:cs="Times New Roman"/>
@@ -355,25 +347,7 @@
                 <w:sz w:val="24"/>
                 <w:szCs w:val="24"/>
               </w:rPr>
-              <w:t xml:space="preserve">{{ </w:t>
-            </w:r>
-            <w:proofErr w:type="spellStart"/>
-            <w:r>
-              <w:rPr>
-                <w:rFonts w:ascii="Times New Roman" w:hAnsi="Times New Roman" w:cs="Times New Roman"/>
-                <w:sz w:val="24"/>
-                <w:szCs w:val="24"/>
-              </w:rPr>
-              <w:t>docket_number</w:t>
-            </w:r>
-            <w:proofErr w:type="spellEnd"/>
-            <w:r>
-              <w:rPr>
-                <w:rFonts w:ascii="Times New Roman" w:hAnsi="Times New Roman" w:cs="Times New Roman"/>
-                <w:sz w:val="24"/>
-                <w:szCs w:val="24"/>
-              </w:rPr>
-              <w:t xml:space="preserve"> }}</w:t>
+              <w:t>{{ docket_number }}</w:t>
             </w:r>
             <w:r>
               <w:rPr>
@@ -498,43 +472,7 @@
           <w:sz w:val="24"/>
           <w:szCs w:val="24"/>
         </w:rPr>
-        <w:t xml:space="preserve">{{ </w:t>
-      </w:r>
-      <w:proofErr w:type="spellStart"/>
-      <w:r>
-        <w:rPr>
-          <w:rFonts w:ascii="Times New Roman" w:hAnsi="Times New Roman" w:cs="Times New Roman"/>
-          <w:sz w:val="24"/>
-          <w:szCs w:val="24"/>
-        </w:rPr>
-        <w:t>doc.name.text</w:t>
-      </w:r>
-      <w:proofErr w:type="spellEnd"/>
-      <w:r>
-        <w:rPr>
-          <w:rFonts w:ascii="Times New Roman" w:hAnsi="Times New Roman" w:cs="Times New Roman"/>
-          <w:sz w:val="24"/>
-          <w:szCs w:val="24"/>
-        </w:rPr>
-        <w:t xml:space="preserve"> }}, {{ </w:t>
-      </w:r>
-      <w:proofErr w:type="spellStart"/>
-      <w:r>
-        <w:rPr>
-          <w:rFonts w:ascii="Times New Roman" w:hAnsi="Times New Roman" w:cs="Times New Roman"/>
-          <w:sz w:val="24"/>
-          <w:szCs w:val="24"/>
-        </w:rPr>
-        <w:t>doc.desc</w:t>
-      </w:r>
-      <w:proofErr w:type="spellEnd"/>
-      <w:r>
-        <w:rPr>
-          <w:rFonts w:ascii="Times New Roman" w:hAnsi="Times New Roman" w:cs="Times New Roman"/>
-          <w:sz w:val="24"/>
-          <w:szCs w:val="24"/>
-        </w:rPr>
-        <w:t xml:space="preserve"> }}</w:t>
+        <w:t>{{ doc.name.text }}, {{ doc.desc }}</w:t>
       </w:r>
     </w:p>
     <w:p>
@@ -552,25 +490,7 @@
           <w:sz w:val="24"/>
           <w:szCs w:val="24"/>
         </w:rPr>
-        <w:t xml:space="preserve">{%p </w:t>
-      </w:r>
-      <w:proofErr w:type="spellStart"/>
-      <w:r>
-        <w:rPr>
-          <w:rFonts w:ascii="Times New Roman" w:hAnsi="Times New Roman" w:cs="Times New Roman"/>
-          <w:sz w:val="24"/>
-          <w:szCs w:val="24"/>
-        </w:rPr>
-        <w:t>endfor</w:t>
-      </w:r>
-      <w:proofErr w:type="spellEnd"/>
-      <w:r>
-        <w:rPr>
-          <w:rFonts w:ascii="Times New Roman" w:hAnsi="Times New Roman" w:cs="Times New Roman"/>
-          <w:sz w:val="24"/>
-          <w:szCs w:val="24"/>
-        </w:rPr>
-        <w:t xml:space="preserve"> %}</w:t>
+        <w:t>{%p endfor %}</w:t>
       </w:r>
     </w:p>
     <w:p>
@@ -640,6 +560,58 @@
           <w:szCs w:val="24"/>
         </w:rPr>
       </w:pPr>
+    </w:p>
+    <w:p>
+      <w:pPr>
+        <w:spacing w:after="0" w:line="240" w:lineRule="auto"/>
+        <w:rPr>
+          <w:rFonts w:ascii="Times New Roman" w:hAnsi="Times New Roman" w:cs="Times New Roman"/>
+          <w:sz w:val="24"/>
+          <w:szCs w:val="24"/>
+        </w:rPr>
+      </w:pPr>
+      <w:r>
+        <w:rPr>
+          <w:rFonts w:ascii="Times New Roman" w:hAnsi="Times New Roman" w:cs="Times New Roman"/>
+          <w:sz w:val="24"/>
+          <w:szCs w:val="24"/>
+        </w:rPr>
+        <w:t xml:space="preserve">{%p if </w:t>
+      </w:r>
+      <w:r>
+        <w:rPr>
+          <w:rFonts w:ascii="Times New Roman" w:hAnsi="Times New Roman" w:cs="Times New Roman"/>
+          <w:sz w:val="24"/>
+          <w:szCs w:val="24"/>
+        </w:rPr>
+        <w:t>appeal_reason_formatted</w:t>
+      </w:r>
+      <w:r>
+        <w:rPr>
+          <w:rFonts w:ascii="Times New Roman" w:hAnsi="Times New Roman" w:cs="Times New Roman"/>
+          <w:sz w:val="24"/>
+          <w:szCs w:val="24"/>
+        </w:rPr>
+        <w:t xml:space="preserve"> | length &gt; 800 %}</w:t>
+      </w:r>
+    </w:p>
+    <w:p>
+      <w:pPr>
+        <w:spacing w:after="0" w:line="240" w:lineRule="auto"/>
+        <w:rPr>
+          <w:rFonts w:ascii="Times New Roman" w:hAnsi="Times New Roman" w:cs="Times New Roman"/>
+          <w:sz w:val="24"/>
+          <w:szCs w:val="24"/>
+        </w:rPr>
+      </w:pPr>
+      <w:r>
+        <w:rPr>
+          <w:rFonts w:ascii="Times New Roman" w:hAnsi="Times New Roman" w:cs="Times New Roman"/>
+          <w:sz w:val="24"/>
+          <w:szCs w:val="24"/>
+        </w:rPr>
+        <w:t>Reasons why I disagree with the referee’s decision:</w:t>
+      </w:r>
     </w:p>
     <w:tbl>
       <w:tblPr>
@@ -676,41 +648,6 @@
                 <w:sz w:val="24"/>
                 <w:szCs w:val="24"/>
               </w:rPr>
-              <w:t xml:space="preserve">{%p if </w:t>
-            </w:r>
-            <w:proofErr w:type="spellStart"/>
-            <w:r>
-              <w:rPr>
-                <w:rFonts w:ascii="Times New Roman" w:hAnsi="Times New Roman" w:cs="Times New Roman"/>
-                <w:sz w:val="24"/>
-                <w:szCs w:val="24"/>
-              </w:rPr>
-              <w:t>appeal_reason_formatted</w:t>
-            </w:r>
-            <w:proofErr w:type="spellEnd"/>
-            <w:r>
-              <w:rPr>
-                <w:rFonts w:ascii="Times New Roman" w:hAnsi="Times New Roman" w:cs="Times New Roman"/>
-                <w:sz w:val="24"/>
-                <w:szCs w:val="24"/>
-              </w:rPr>
-              <w:t xml:space="preserve"> | length &gt; 800 %}</w:t>
-            </w:r>
-          </w:p>
-          <w:p>
-            <w:pPr>
-              <w:rPr>
-                <w:rFonts w:ascii="Times New Roman" w:hAnsi="Times New Roman" w:cs="Times New Roman"/>
-                <w:sz w:val="24"/>
-                <w:szCs w:val="24"/>
-              </w:rPr>
-            </w:pPr>
-            <w:r>
-              <w:rPr>
-                <w:rFonts w:ascii="Times New Roman" w:hAnsi="Times New Roman" w:cs="Times New Roman"/>
-                <w:sz w:val="24"/>
-                <w:szCs w:val="24"/>
-              </w:rPr>
               <w:t>{</w:t>
             </w:r>
             <w:r>
@@ -721,7 +658,6 @@
               </w:rPr>
               <w:t xml:space="preserve">{ </w:t>
             </w:r>
-            <w:proofErr w:type="spellStart"/>
             <w:r>
               <w:rPr>
                 <w:rFonts w:ascii="Times New Roman" w:hAnsi="Times New Roman" w:cs="Times New Roman"/>
@@ -730,7 +666,6 @@
               </w:rPr>
               <w:t>appeal_reason_formatted</w:t>
             </w:r>
-            <w:proofErr w:type="spellEnd"/>
             <w:r>
               <w:rPr>
                 <w:rFonts w:ascii="Times New Roman" w:hAnsi="Times New Roman" w:cs="Times New Roman"/>
@@ -746,23 +681,6 @@
                 <w:szCs w:val="24"/>
               </w:rPr>
               <w:t>}}</w:t>
-            </w:r>
-          </w:p>
-          <w:p>
-            <w:pPr>
-              <w:rPr>
-                <w:rFonts w:ascii="Times New Roman" w:hAnsi="Times New Roman" w:cs="Times New Roman"/>
-                <w:sz w:val="24"/>
-                <w:szCs w:val="24"/>
-              </w:rPr>
-            </w:pPr>
-            <w:r>
-              <w:rPr>
-                <w:rFonts w:ascii="Times New Roman" w:hAnsi="Times New Roman" w:cs="Times New Roman"/>
-                <w:sz w:val="24"/>
-                <w:szCs w:val="24"/>
-              </w:rPr>
-              <w:t>{% endif %}</w:t>
             </w:r>
           </w:p>
         </w:tc>
@@ -777,6 +695,14 @@
           <w:szCs w:val="24"/>
         </w:rPr>
       </w:pPr>
+      <w:r>
+        <w:rPr>
+          <w:rFonts w:ascii="Times New Roman" w:hAnsi="Times New Roman" w:cs="Times New Roman"/>
+          <w:sz w:val="24"/>
+          <w:szCs w:val="24"/>
+        </w:rPr>
+        <w:t>{% endif %}</w:t>
+      </w:r>
     </w:p>
     <w:sectPr>
       <w:pgSz w:w="12240" w:h="15840"/>
@@ -789,7 +715,7 @@
 </file>
 
 <file path=word/numbering.xml><?xml version="1.0" encoding="utf-8"?>
-<w:numbering xmlns:wpc="http://schemas.microsoft.com/office/word/2010/wordprocessingCanvas" xmlns:cx="http://schemas.microsoft.com/office/drawing/2014/chartex" xmlns:cx1="http://schemas.microsoft.com/office/drawing/2015/9/8/chartex" xmlns:cx2="http://schemas.microsoft.com/office/drawing/2015/10/21/chartex" xmlns:cx3="http://schemas.microsoft.com/office/drawing/2016/5/9/chartex" xmlns:cx4="http://schemas.microsoft.com/office/drawing/2016/5/10/chartex" xmlns:cx5="http://schemas.microsoft.com/office/drawing/2016/5/11/chartex" xmlns:cx6="http://schemas.microsoft.com/office/drawing/2016/5/12/chartex" xmlns:cx7="http://schemas.microsoft.com/office/drawing/2016/5/13/chartex" xmlns:cx8="http://schemas.microsoft.com/office/drawing/2016/5/14/chartex" xmlns:mc="http://schemas.openxmlformats.org/markup-compatibility/2006" xmlns:aink="http://schemas.microsoft.com/office/drawing/2016/ink" xmlns:am3d="http://schemas.microsoft.com/office/drawing/2017/model3d" xmlns:o="urn:schemas-microsoft-com:office:office" xmlns:oel="http://schemas.microsoft.com/office/2019/extlst" xmlns:r="http://schemas.openxmlformats.org/officeDocument/2006/relationships" xmlns:m="http://schemas.openxmlformats.org/officeDocument/2006/math" xmlns:v="urn:schemas-microsoft-com:vml" xmlns:wp14="http://schemas.microsoft.com/office/word/2010/wordprocessingDrawing" xmlns:wp="http://schemas.openxmlformats.org/drawingml/2006/wordprocessingDrawing" xmlns:w10="urn:schemas-microsoft-com:office:word" xmlns:w="http://schemas.openxmlformats.org/wordprocessingml/2006/main" xmlns:w14="http://schemas.microsoft.com/office/word/2010/wordml" xmlns:w15="http://schemas.microsoft.com/office/word/2012/wordml" xmlns:w16cex="http://schemas.microsoft.com/office/word/2018/wordml/cex" xmlns:w16cid="http://schemas.microsoft.com/office/word/2016/wordml/cid" xmlns:w16="http://schemas.microsoft.com/office/word/2018/wordml" xmlns:w16sdtdh="http://schemas.microsoft.com/office/word/2020/wordml/sdtdatahash" xmlns:w16se="http://schemas.microsoft.com/office/word/2015/wordml/symex" xmlns:wpg="http://schemas.microsoft.com/office/word/2010/wordprocessingGroup" xmlns:wpi="http://schemas.microsoft.com/office/word/2010/wordprocessingInk" xmlns:wne="http://schemas.microsoft.com/office/word/2006/wordml" xmlns:wps="http://schemas.microsoft.com/office/word/2010/wordprocessingShape" mc:Ignorable="w14 w15 w16se w16cid w16 w16cex w16sdtdh wp14">
+<w:numbering xmlns:wpc="http://schemas.microsoft.com/office/word/2010/wordprocessingCanvas" xmlns:cx="http://schemas.microsoft.com/office/drawing/2014/chartex" xmlns:cx1="http://schemas.microsoft.com/office/drawing/2015/9/8/chartex" xmlns:cx2="http://schemas.microsoft.com/office/drawing/2015/10/21/chartex" xmlns:cx3="http://schemas.microsoft.com/office/drawing/2016/5/9/chartex" xmlns:cx4="http://schemas.microsoft.com/office/drawing/2016/5/10/chartex" xmlns:cx5="http://schemas.microsoft.com/office/drawing/2016/5/11/chartex" xmlns:cx6="http://schemas.microsoft.com/office/drawing/2016/5/12/chartex" xmlns:cx7="http://schemas.microsoft.com/office/drawing/2016/5/13/chartex" xmlns:cx8="http://schemas.microsoft.com/office/drawing/2016/5/14/chartex" xmlns:mc="http://schemas.openxmlformats.org/markup-compatibility/2006" xmlns:aink="http://schemas.microsoft.com/office/drawing/2016/ink" xmlns:am3d="http://schemas.microsoft.com/office/drawing/2017/model3d" xmlns:o="urn:schemas-microsoft-com:office:office" xmlns:oel="http://schemas.microsoft.com/office/2019/extlst" xmlns:r="http://schemas.openxmlformats.org/officeDocument/2006/relationships" xmlns:m="http://schemas.openxmlformats.org/officeDocument/2006/math" xmlns:v="urn:schemas-microsoft-com:vml" xmlns:wp14="http://schemas.microsoft.com/office/word/2010/wordprocessingDrawing" xmlns:wp="http://schemas.openxmlformats.org/drawingml/2006/wordprocessingDrawing" xmlns:w10="urn:schemas-microsoft-com:office:word" xmlns:w="http://schemas.openxmlformats.org/wordprocessingml/2006/main" xmlns:w14="http://schemas.microsoft.com/office/word/2010/wordml" xmlns:w15="http://schemas.microsoft.com/office/word/2012/wordml" xmlns:w16cex="http://schemas.microsoft.com/office/word/2018/wordml/cex" xmlns:w16cid="http://schemas.microsoft.com/office/word/2016/wordml/cid" xmlns:w16="http://schemas.microsoft.com/office/word/2018/wordml" xmlns:w16du="http://schemas.microsoft.com/office/word/2023/wordml/word16du" xmlns:w16sdtdh="http://schemas.microsoft.com/office/word/2020/wordml/sdtdatahash" xmlns:w16sdtfl="http://schemas.microsoft.com/office/word/2024/wordml/sdtformatlock" xmlns:w16se="http://schemas.microsoft.com/office/word/2015/wordml/symex" xmlns:wpg="http://schemas.microsoft.com/office/word/2010/wordprocessingGroup" xmlns:wpi="http://schemas.microsoft.com/office/word/2010/wordprocessingInk" xmlns:wne="http://schemas.microsoft.com/office/word/2006/wordml" xmlns:wps="http://schemas.microsoft.com/office/word/2010/wordprocessingShape" mc:Ignorable="w14 w15 w16se w16cid w16 w16cex w16sdtdh w16sdtfl w16du wp14">
   <w:abstractNum w:abstractNumId="0" w15:restartNumberingAfterBreak="0">
     <w:nsid w:val="25753F59"/>
     <w:multiLevelType w:val="hybridMultilevel"/>
@@ -910,7 +836,7 @@
 </file>
 
 <file path=word/styles.xml><?xml version="1.0" encoding="utf-8"?>
-<w:styles xmlns:mc="http://schemas.openxmlformats.org/markup-compatibility/2006" xmlns:r="http://schemas.openxmlformats.org/officeDocument/2006/relationships" xmlns:w="http://schemas.openxmlformats.org/wordprocessingml/2006/main" xmlns:w14="http://schemas.microsoft.com/office/word/2010/wordml" xmlns:w15="http://schemas.microsoft.com/office/word/2012/wordml" xmlns:w16cex="http://schemas.microsoft.com/office/word/2018/wordml/cex" xmlns:w16cid="http://schemas.microsoft.com/office/word/2016/wordml/cid" xmlns:w16="http://schemas.microsoft.com/office/word/2018/wordml" xmlns:w16sdtdh="http://schemas.microsoft.com/office/word/2020/wordml/sdtdatahash" xmlns:w16se="http://schemas.microsoft.com/office/word/2015/wordml/symex" mc:Ignorable="w14 w15 w16se w16cid w16 w16cex w16sdtdh">
+<w:styles xmlns:mc="http://schemas.openxmlformats.org/markup-compatibility/2006" xmlns:r="http://schemas.openxmlformats.org/officeDocument/2006/relationships" xmlns:w="http://schemas.openxmlformats.org/wordprocessingml/2006/main" xmlns:w14="http://schemas.microsoft.com/office/word/2010/wordml" xmlns:w15="http://schemas.microsoft.com/office/word/2012/wordml" xmlns:w16cex="http://schemas.microsoft.com/office/word/2018/wordml/cex" xmlns:w16cid="http://schemas.microsoft.com/office/word/2016/wordml/cid" xmlns:w16="http://schemas.microsoft.com/office/word/2018/wordml" xmlns:w16du="http://schemas.microsoft.com/office/word/2023/wordml/word16du" xmlns:w16sdtdh="http://schemas.microsoft.com/office/word/2020/wordml/sdtdatahash" xmlns:w16sdtfl="http://schemas.microsoft.com/office/word/2024/wordml/sdtformatlock" xmlns:w16se="http://schemas.microsoft.com/office/word/2015/wordml/symex" mc:Ignorable="w14 w15 w16se w16cid w16 w16cex w16sdtdh w16sdtfl w16du">
   <w:docDefaults>
     <w:rPrDefault>
       <w:rPr>

</xml_diff>

<commit_message>
updated interview and forms
</commit_message>
<xml_diff>
--- a/docassemble/UIAppealAfterHearing/data/templates/additional_attachments.docx
+++ b/docassemble/UIAppealAfterHearing/data/templates/additional_attachments.docx
@@ -130,13 +130,59 @@
                 <w:szCs w:val="24"/>
               </w:rPr>
             </w:pPr>
-            <w:r>
-              <w:rPr>
-                <w:rFonts w:ascii="Times New Roman" w:hAnsi="Times New Roman" w:cs="Times New Roman"/>
-                <w:sz w:val="24"/>
-                <w:szCs w:val="24"/>
-              </w:rPr>
-              <w:t>{{ users[0].name_full() }}</w:t>
+            <w:proofErr w:type="gramStart"/>
+            <w:r>
+              <w:rPr>
+                <w:rFonts w:ascii="Times New Roman" w:hAnsi="Times New Roman" w:cs="Times New Roman"/>
+                <w:sz w:val="24"/>
+                <w:szCs w:val="24"/>
+              </w:rPr>
+              <w:t>{{ users</w:t>
+            </w:r>
+            <w:proofErr w:type="gramEnd"/>
+            <w:r>
+              <w:rPr>
+                <w:rFonts w:ascii="Times New Roman" w:hAnsi="Times New Roman" w:cs="Times New Roman"/>
+                <w:sz w:val="24"/>
+                <w:szCs w:val="24"/>
+              </w:rPr>
+              <w:t>[0].</w:t>
+            </w:r>
+            <w:proofErr w:type="spellStart"/>
+            <w:r>
+              <w:rPr>
+                <w:rFonts w:ascii="Times New Roman" w:hAnsi="Times New Roman" w:cs="Times New Roman"/>
+                <w:sz w:val="24"/>
+                <w:szCs w:val="24"/>
+              </w:rPr>
+              <w:t>name_</w:t>
+            </w:r>
+            <w:proofErr w:type="gramStart"/>
+            <w:r>
+              <w:rPr>
+                <w:rFonts w:ascii="Times New Roman" w:hAnsi="Times New Roman" w:cs="Times New Roman"/>
+                <w:sz w:val="24"/>
+                <w:szCs w:val="24"/>
+              </w:rPr>
+              <w:t>full</w:t>
+            </w:r>
+            <w:proofErr w:type="spellEnd"/>
+            <w:r>
+              <w:rPr>
+                <w:rFonts w:ascii="Times New Roman" w:hAnsi="Times New Roman" w:cs="Times New Roman"/>
+                <w:sz w:val="24"/>
+                <w:szCs w:val="24"/>
+              </w:rPr>
+              <w:t>(</w:t>
+            </w:r>
+            <w:proofErr w:type="gramEnd"/>
+            <w:r>
+              <w:rPr>
+                <w:rFonts w:ascii="Times New Roman" w:hAnsi="Times New Roman" w:cs="Times New Roman"/>
+                <w:sz w:val="24"/>
+                <w:szCs w:val="24"/>
+              </w:rPr>
+              <w:t>) }}</w:t>
             </w:r>
           </w:p>
         </w:tc>
@@ -203,90 +249,59 @@
                 <w:szCs w:val="24"/>
               </w:rPr>
             </w:pPr>
-            <w:r>
-              <w:rPr>
-                <w:rFonts w:ascii="Times New Roman" w:hAnsi="Times New Roman" w:cs="Times New Roman"/>
-                <w:sz w:val="24"/>
-                <w:szCs w:val="24"/>
-              </w:rPr>
-              <w:t>{{ (users[0].id_or_ssn|int)|string }}</w:t>
-            </w:r>
-          </w:p>
-        </w:tc>
-      </w:tr>
-      <w:tr>
-        <w:trPr>
-          <w:trHeight w:val="350"/>
-        </w:trPr>
-        <w:tc>
-          <w:tcPr>
-            <w:tcW w:w="2335" w:type="dxa"/>
-          </w:tcPr>
-          <w:p>
-            <w:pPr>
-              <w:rPr>
-                <w:rFonts w:ascii="Times New Roman" w:hAnsi="Times New Roman" w:cs="Times New Roman"/>
-                <w:sz w:val="24"/>
-                <w:szCs w:val="24"/>
-              </w:rPr>
-            </w:pPr>
-            <w:r>
-              <w:rPr>
-                <w:rFonts w:ascii="Times New Roman" w:hAnsi="Times New Roman" w:cs="Times New Roman"/>
-                <w:b/>
-                <w:bCs/>
-                <w:sz w:val="24"/>
-                <w:szCs w:val="24"/>
-              </w:rPr>
-              <w:t>Date Appeal Filed:</w:t>
-            </w:r>
-          </w:p>
-        </w:tc>
-        <w:tc>
-          <w:tcPr>
-            <w:tcW w:w="7015" w:type="dxa"/>
-          </w:tcPr>
-          <w:p>
-            <w:pPr>
-              <w:rPr>
-                <w:rFonts w:ascii="Times New Roman" w:hAnsi="Times New Roman" w:cs="Times New Roman"/>
-                <w:b/>
-                <w:bCs/>
-                <w:sz w:val="24"/>
-                <w:szCs w:val="24"/>
-              </w:rPr>
-            </w:pPr>
-            <w:r>
-              <w:rPr>
-                <w:rFonts w:ascii="Times New Roman" w:hAnsi="Times New Roman" w:cs="Times New Roman"/>
-                <w:sz w:val="24"/>
-                <w:szCs w:val="24"/>
-              </w:rPr>
-              <w:t xml:space="preserve">{{ </w:t>
-            </w:r>
-            <w:r>
-              <w:rPr>
-                <w:rFonts w:ascii="Times New Roman" w:hAnsi="Times New Roman" w:cs="Times New Roman"/>
-                <w:sz w:val="24"/>
-                <w:szCs w:val="24"/>
-              </w:rPr>
-              <w:t>appeal_date</w:t>
-            </w:r>
-            <w:r>
-              <w:rPr>
-                <w:rFonts w:ascii="Times New Roman" w:hAnsi="Times New Roman" w:cs="Times New Roman"/>
-                <w:sz w:val="24"/>
-                <w:szCs w:val="24"/>
-              </w:rPr>
-              <w:t xml:space="preserve"> </w:t>
-            </w:r>
-            <w:r>
-              <w:rPr>
-                <w:rFonts w:ascii="Times New Roman" w:hAnsi="Times New Roman" w:cs="Times New Roman"/>
-                <w:sz w:val="24"/>
-                <w:szCs w:val="24"/>
-              </w:rPr>
-              <w:t>}}</w:t>
+            <w:proofErr w:type="gramStart"/>
+            <w:r>
+              <w:rPr>
+                <w:rFonts w:ascii="Times New Roman" w:hAnsi="Times New Roman" w:cs="Times New Roman"/>
+                <w:sz w:val="24"/>
+                <w:szCs w:val="24"/>
+              </w:rPr>
+              <w:t>{{ (</w:t>
+            </w:r>
+            <w:proofErr w:type="gramEnd"/>
+            <w:r>
+              <w:rPr>
+                <w:rFonts w:ascii="Times New Roman" w:hAnsi="Times New Roman" w:cs="Times New Roman"/>
+                <w:sz w:val="24"/>
+                <w:szCs w:val="24"/>
+              </w:rPr>
+              <w:t>users[0].</w:t>
+            </w:r>
+            <w:proofErr w:type="spellStart"/>
+            <w:r>
+              <w:rPr>
+                <w:rFonts w:ascii="Times New Roman" w:hAnsi="Times New Roman" w:cs="Times New Roman"/>
+                <w:sz w:val="24"/>
+                <w:szCs w:val="24"/>
+              </w:rPr>
+              <w:t>id_or_ssn|</w:t>
+            </w:r>
+            <w:proofErr w:type="gramStart"/>
+            <w:r>
+              <w:rPr>
+                <w:rFonts w:ascii="Times New Roman" w:hAnsi="Times New Roman" w:cs="Times New Roman"/>
+                <w:sz w:val="24"/>
+                <w:szCs w:val="24"/>
+              </w:rPr>
+              <w:t>int</w:t>
+            </w:r>
+            <w:proofErr w:type="spellEnd"/>
+            <w:r>
+              <w:rPr>
+                <w:rFonts w:ascii="Times New Roman" w:hAnsi="Times New Roman" w:cs="Times New Roman"/>
+                <w:sz w:val="24"/>
+                <w:szCs w:val="24"/>
+              </w:rPr>
+              <w:t>)|</w:t>
+            </w:r>
+            <w:proofErr w:type="gramEnd"/>
+            <w:r>
+              <w:rPr>
+                <w:rFonts w:ascii="Times New Roman" w:hAnsi="Times New Roman" w:cs="Times New Roman"/>
+                <w:sz w:val="24"/>
+                <w:szCs w:val="24"/>
+              </w:rPr>
+              <w:t>string }}</w:t>
             </w:r>
           </w:p>
         </w:tc>
@@ -341,13 +356,59 @@
                 <w:szCs w:val="24"/>
               </w:rPr>
             </w:pPr>
-            <w:r>
-              <w:rPr>
-                <w:rFonts w:ascii="Times New Roman" w:hAnsi="Times New Roman" w:cs="Times New Roman"/>
-                <w:sz w:val="24"/>
-                <w:szCs w:val="24"/>
-              </w:rPr>
-              <w:t>{{ docket_number }}</w:t>
+            <w:proofErr w:type="gramStart"/>
+            <w:r>
+              <w:rPr>
+                <w:rFonts w:ascii="Times New Roman" w:hAnsi="Times New Roman" w:cs="Times New Roman"/>
+                <w:sz w:val="24"/>
+                <w:szCs w:val="24"/>
+              </w:rPr>
+              <w:t xml:space="preserve">{{ </w:t>
+            </w:r>
+            <w:proofErr w:type="spellStart"/>
+            <w:r>
+              <w:rPr>
+                <w:rFonts w:ascii="Times New Roman" w:hAnsi="Times New Roman" w:cs="Times New Roman"/>
+                <w:sz w:val="24"/>
+                <w:szCs w:val="24"/>
+              </w:rPr>
+              <w:t>docket</w:t>
+            </w:r>
+            <w:proofErr w:type="gramEnd"/>
+            <w:r>
+              <w:rPr>
+                <w:rFonts w:ascii="Times New Roman" w:hAnsi="Times New Roman" w:cs="Times New Roman"/>
+                <w:sz w:val="24"/>
+                <w:szCs w:val="24"/>
+              </w:rPr>
+              <w:t>_</w:t>
+            </w:r>
+            <w:proofErr w:type="gramStart"/>
+            <w:r>
+              <w:rPr>
+                <w:rFonts w:ascii="Times New Roman" w:hAnsi="Times New Roman" w:cs="Times New Roman"/>
+                <w:sz w:val="24"/>
+                <w:szCs w:val="24"/>
+              </w:rPr>
+              <w:t>number</w:t>
+            </w:r>
+            <w:proofErr w:type="spellEnd"/>
+            <w:r>
+              <w:rPr>
+                <w:rFonts w:ascii="Times New Roman" w:hAnsi="Times New Roman" w:cs="Times New Roman"/>
+                <w:sz w:val="24"/>
+                <w:szCs w:val="24"/>
+              </w:rPr>
+              <w:t xml:space="preserve"> }</w:t>
+            </w:r>
+            <w:proofErr w:type="gramEnd"/>
+            <w:r>
+              <w:rPr>
+                <w:rFonts w:ascii="Times New Roman" w:hAnsi="Times New Roman" w:cs="Times New Roman"/>
+                <w:sz w:val="24"/>
+                <w:szCs w:val="24"/>
+              </w:rPr>
+              <w:t>}</w:t>
             </w:r>
             <w:r>
               <w:rPr>
@@ -399,6 +460,7 @@
         </w:rPr>
         <w:t xml:space="preserve"> </w:t>
       </w:r>
+      <w:proofErr w:type="gramStart"/>
       <w:r>
         <w:rPr>
           <w:rFonts w:ascii="Times New Roman" w:hAnsi="Times New Roman" w:cs="Times New Roman"/>
@@ -413,8 +475,27 @@
           <w:sz w:val="24"/>
           <w:szCs w:val="24"/>
         </w:rPr>
-        <w:t xml:space="preserve"> | length &gt; 2 %}</w:t>
-      </w:r>
+        <w:t xml:space="preserve"> | length</w:t>
+      </w:r>
+      <w:proofErr w:type="gramEnd"/>
+      <w:r>
+        <w:rPr>
+          <w:rFonts w:ascii="Times New Roman" w:hAnsi="Times New Roman" w:cs="Times New Roman"/>
+          <w:sz w:val="24"/>
+          <w:szCs w:val="24"/>
+        </w:rPr>
+        <w:t xml:space="preserve"> &gt; </w:t>
+      </w:r>
+      <w:proofErr w:type="gramStart"/>
+      <w:r>
+        <w:rPr>
+          <w:rFonts w:ascii="Times New Roman" w:hAnsi="Times New Roman" w:cs="Times New Roman"/>
+          <w:sz w:val="24"/>
+          <w:szCs w:val="24"/>
+        </w:rPr>
+        <w:t>2 %}</w:t>
+      </w:r>
+      <w:proofErr w:type="gramEnd"/>
     </w:p>
     <w:p>
       <w:pPr>
@@ -449,8 +530,18 @@
           <w:sz w:val="24"/>
           <w:szCs w:val="24"/>
         </w:rPr>
-        <w:t>{%p for doc in attachments %}</w:t>
-      </w:r>
+        <w:t xml:space="preserve">{%p for doc in </w:t>
+      </w:r>
+      <w:proofErr w:type="gramStart"/>
+      <w:r>
+        <w:rPr>
+          <w:rFonts w:ascii="Times New Roman" w:hAnsi="Times New Roman" w:cs="Times New Roman"/>
+          <w:sz w:val="24"/>
+          <w:szCs w:val="24"/>
+        </w:rPr>
+        <w:t>attachments %}</w:t>
+      </w:r>
+      <w:proofErr w:type="gramEnd"/>
     </w:p>
     <w:p>
       <w:pPr>
@@ -466,13 +557,113 @@
           <w:szCs w:val="24"/>
         </w:rPr>
       </w:pPr>
-      <w:r>
-        <w:rPr>
-          <w:rFonts w:ascii="Times New Roman" w:hAnsi="Times New Roman" w:cs="Times New Roman"/>
-          <w:sz w:val="24"/>
-          <w:szCs w:val="24"/>
-        </w:rPr>
-        <w:t>{{ doc.name.text }}, {{ doc.desc }}</w:t>
+      <w:proofErr w:type="gramStart"/>
+      <w:r>
+        <w:rPr>
+          <w:rFonts w:ascii="Times New Roman" w:hAnsi="Times New Roman" w:cs="Times New Roman"/>
+          <w:sz w:val="24"/>
+          <w:szCs w:val="24"/>
+        </w:rPr>
+        <w:t xml:space="preserve">{{ </w:t>
+      </w:r>
+      <w:proofErr w:type="spellStart"/>
+      <w:r>
+        <w:rPr>
+          <w:rFonts w:ascii="Times New Roman" w:hAnsi="Times New Roman" w:cs="Times New Roman"/>
+          <w:sz w:val="24"/>
+          <w:szCs w:val="24"/>
+        </w:rPr>
+        <w:t>doc.name</w:t>
+      </w:r>
+      <w:proofErr w:type="gramEnd"/>
+      <w:r>
+        <w:rPr>
+          <w:rFonts w:ascii="Times New Roman" w:hAnsi="Times New Roman" w:cs="Times New Roman"/>
+          <w:sz w:val="24"/>
+          <w:szCs w:val="24"/>
+        </w:rPr>
+        <w:t>.</w:t>
+      </w:r>
+      <w:proofErr w:type="gramStart"/>
+      <w:r>
+        <w:rPr>
+          <w:rFonts w:ascii="Times New Roman" w:hAnsi="Times New Roman" w:cs="Times New Roman"/>
+          <w:sz w:val="24"/>
+          <w:szCs w:val="24"/>
+        </w:rPr>
+        <w:t>text</w:t>
+      </w:r>
+      <w:proofErr w:type="spellEnd"/>
+      <w:r>
+        <w:rPr>
+          <w:rFonts w:ascii="Times New Roman" w:hAnsi="Times New Roman" w:cs="Times New Roman"/>
+          <w:sz w:val="24"/>
+          <w:szCs w:val="24"/>
+        </w:rPr>
+        <w:t xml:space="preserve"> }</w:t>
+      </w:r>
+      <w:proofErr w:type="gramEnd"/>
+      <w:r>
+        <w:rPr>
+          <w:rFonts w:ascii="Times New Roman" w:hAnsi="Times New Roman" w:cs="Times New Roman"/>
+          <w:sz w:val="24"/>
+          <w:szCs w:val="24"/>
+        </w:rPr>
+        <w:t xml:space="preserve">}, </w:t>
+      </w:r>
+      <w:proofErr w:type="gramStart"/>
+      <w:r>
+        <w:rPr>
+          <w:rFonts w:ascii="Times New Roman" w:hAnsi="Times New Roman" w:cs="Times New Roman"/>
+          <w:sz w:val="24"/>
+          <w:szCs w:val="24"/>
+        </w:rPr>
+        <w:t xml:space="preserve">{{ </w:t>
+      </w:r>
+      <w:proofErr w:type="spellStart"/>
+      <w:r>
+        <w:rPr>
+          <w:rFonts w:ascii="Times New Roman" w:hAnsi="Times New Roman" w:cs="Times New Roman"/>
+          <w:sz w:val="24"/>
+          <w:szCs w:val="24"/>
+        </w:rPr>
+        <w:t>doc</w:t>
+      </w:r>
+      <w:proofErr w:type="gramEnd"/>
+      <w:r>
+        <w:rPr>
+          <w:rFonts w:ascii="Times New Roman" w:hAnsi="Times New Roman" w:cs="Times New Roman"/>
+          <w:sz w:val="24"/>
+          <w:szCs w:val="24"/>
+        </w:rPr>
+        <w:t>.</w:t>
+      </w:r>
+      <w:proofErr w:type="gramStart"/>
+      <w:r>
+        <w:rPr>
+          <w:rFonts w:ascii="Times New Roman" w:hAnsi="Times New Roman" w:cs="Times New Roman"/>
+          <w:sz w:val="24"/>
+          <w:szCs w:val="24"/>
+        </w:rPr>
+        <w:t>desc</w:t>
+      </w:r>
+      <w:proofErr w:type="spellEnd"/>
+      <w:r>
+        <w:rPr>
+          <w:rFonts w:ascii="Times New Roman" w:hAnsi="Times New Roman" w:cs="Times New Roman"/>
+          <w:sz w:val="24"/>
+          <w:szCs w:val="24"/>
+        </w:rPr>
+        <w:t xml:space="preserve"> }</w:t>
+      </w:r>
+      <w:proofErr w:type="gramEnd"/>
+      <w:r>
+        <w:rPr>
+          <w:rFonts w:ascii="Times New Roman" w:hAnsi="Times New Roman" w:cs="Times New Roman"/>
+          <w:sz w:val="24"/>
+          <w:szCs w:val="24"/>
+        </w:rPr>
+        <w:t>}</w:t>
       </w:r>
     </w:p>
     <w:p>
@@ -490,8 +681,28 @@
           <w:sz w:val="24"/>
           <w:szCs w:val="24"/>
         </w:rPr>
-        <w:t>{%p endfor %}</w:t>
-      </w:r>
+        <w:t xml:space="preserve">{%p </w:t>
+      </w:r>
+      <w:proofErr w:type="spellStart"/>
+      <w:proofErr w:type="gramStart"/>
+      <w:r>
+        <w:rPr>
+          <w:rFonts w:ascii="Times New Roman" w:hAnsi="Times New Roman" w:cs="Times New Roman"/>
+          <w:sz w:val="24"/>
+          <w:szCs w:val="24"/>
+        </w:rPr>
+        <w:t>endfor</w:t>
+      </w:r>
+      <w:proofErr w:type="spellEnd"/>
+      <w:r>
+        <w:rPr>
+          <w:rFonts w:ascii="Times New Roman" w:hAnsi="Times New Roman" w:cs="Times New Roman"/>
+          <w:sz w:val="24"/>
+          <w:szCs w:val="24"/>
+        </w:rPr>
+        <w:t xml:space="preserve"> %}</w:t>
+      </w:r>
+      <w:proofErr w:type="gramEnd"/>
     </w:p>
     <w:p>
       <w:pPr>
@@ -526,6 +737,7 @@
         </w:rPr>
         <w:t xml:space="preserve"> </w:t>
       </w:r>
+      <w:proofErr w:type="gramStart"/>
       <w:r>
         <w:rPr>
           <w:rFonts w:ascii="Times New Roman" w:hAnsi="Times New Roman" w:cs="Times New Roman"/>
@@ -550,6 +762,7 @@
         </w:rPr>
         <w:t>}</w:t>
       </w:r>
+      <w:proofErr w:type="gramEnd"/>
     </w:p>
     <w:p>
       <w:pPr>
@@ -578,6 +791,7 @@
         </w:rPr>
         <w:t xml:space="preserve">{%p if </w:t>
       </w:r>
+      <w:proofErr w:type="spellStart"/>
       <w:r>
         <w:rPr>
           <w:rFonts w:ascii="Times New Roman" w:hAnsi="Times New Roman" w:cs="Times New Roman"/>
@@ -586,14 +800,25 @@
         </w:rPr>
         <w:t>appeal_reason_formatted</w:t>
       </w:r>
-      <w:r>
-        <w:rPr>
-          <w:rFonts w:ascii="Times New Roman" w:hAnsi="Times New Roman" w:cs="Times New Roman"/>
-          <w:sz w:val="24"/>
-          <w:szCs w:val="24"/>
-        </w:rPr>
-        <w:t xml:space="preserve"> | length &gt; 800 %}</w:t>
-      </w:r>
+      <w:proofErr w:type="spellEnd"/>
+      <w:r>
+        <w:rPr>
+          <w:rFonts w:ascii="Times New Roman" w:hAnsi="Times New Roman" w:cs="Times New Roman"/>
+          <w:sz w:val="24"/>
+          <w:szCs w:val="24"/>
+        </w:rPr>
+        <w:t xml:space="preserve"> | length &gt; </w:t>
+      </w:r>
+      <w:proofErr w:type="gramStart"/>
+      <w:r>
+        <w:rPr>
+          <w:rFonts w:ascii="Times New Roman" w:hAnsi="Times New Roman" w:cs="Times New Roman"/>
+          <w:sz w:val="24"/>
+          <w:szCs w:val="24"/>
+        </w:rPr>
+        <w:t>800 %}</w:t>
+      </w:r>
+      <w:proofErr w:type="gramEnd"/>
     </w:p>
     <w:p>
       <w:pPr>
@@ -642,6 +867,7 @@
                 <w:szCs w:val="24"/>
               </w:rPr>
             </w:pPr>
+            <w:proofErr w:type="gramStart"/>
             <w:r>
               <w:rPr>
                 <w:rFonts w:ascii="Times New Roman" w:hAnsi="Times New Roman" w:cs="Times New Roman"/>
@@ -658,14 +884,25 @@
               </w:rPr>
               <w:t xml:space="preserve">{ </w:t>
             </w:r>
-            <w:r>
-              <w:rPr>
-                <w:rFonts w:ascii="Times New Roman" w:hAnsi="Times New Roman" w:cs="Times New Roman"/>
-                <w:sz w:val="24"/>
-                <w:szCs w:val="24"/>
-              </w:rPr>
-              <w:t>appeal_reason_formatted</w:t>
-            </w:r>
+            <w:proofErr w:type="spellStart"/>
+            <w:r>
+              <w:rPr>
+                <w:rFonts w:ascii="Times New Roman" w:hAnsi="Times New Roman" w:cs="Times New Roman"/>
+                <w:sz w:val="24"/>
+                <w:szCs w:val="24"/>
+              </w:rPr>
+              <w:t>appeal</w:t>
+            </w:r>
+            <w:proofErr w:type="gramEnd"/>
+            <w:r>
+              <w:rPr>
+                <w:rFonts w:ascii="Times New Roman" w:hAnsi="Times New Roman" w:cs="Times New Roman"/>
+                <w:sz w:val="24"/>
+                <w:szCs w:val="24"/>
+              </w:rPr>
+              <w:t>_reason_formatted</w:t>
+            </w:r>
+            <w:proofErr w:type="spellEnd"/>
             <w:r>
               <w:rPr>
                 <w:rFonts w:ascii="Times New Roman" w:hAnsi="Times New Roman" w:cs="Times New Roman"/>

</xml_diff>

<commit_message>
additional attachments list tweak
</commit_message>
<xml_diff>
--- a/docassemble/UIAppealAfterHearing/data/templates/additional_attachments.docx
+++ b/docassemble/UIAppealAfterHearing/data/templates/additional_attachments.docx
@@ -460,6 +460,22 @@
         </w:rPr>
         <w:t xml:space="preserve"> </w:t>
       </w:r>
+      <w:r>
+        <w:rPr>
+          <w:rFonts w:ascii="Times New Roman" w:hAnsi="Times New Roman" w:cs="Times New Roman"/>
+          <w:sz w:val="24"/>
+          <w:szCs w:val="24"/>
+        </w:rPr>
+        <w:t>attachments</w:t>
+      </w:r>
+      <w:r>
+        <w:rPr>
+          <w:rFonts w:ascii="Times New Roman" w:hAnsi="Times New Roman" w:cs="Times New Roman"/>
+          <w:sz w:val="24"/>
+          <w:szCs w:val="24"/>
+        </w:rPr>
+        <w:t xml:space="preserve"> | length &gt; </w:t>
+      </w:r>
       <w:proofErr w:type="gramStart"/>
       <w:r>
         <w:rPr>
@@ -467,33 +483,15 @@
           <w:sz w:val="24"/>
           <w:szCs w:val="24"/>
         </w:rPr>
-        <w:t>attachments</w:t>
-      </w:r>
-      <w:r>
-        <w:rPr>
-          <w:rFonts w:ascii="Times New Roman" w:hAnsi="Times New Roman" w:cs="Times New Roman"/>
-          <w:sz w:val="24"/>
-          <w:szCs w:val="24"/>
-        </w:rPr>
-        <w:t xml:space="preserve"> | length</w:t>
-      </w:r>
-      <w:proofErr w:type="gramEnd"/>
-      <w:r>
-        <w:rPr>
-          <w:rFonts w:ascii="Times New Roman" w:hAnsi="Times New Roman" w:cs="Times New Roman"/>
-          <w:sz w:val="24"/>
-          <w:szCs w:val="24"/>
-        </w:rPr>
-        <w:t xml:space="preserve"> &gt; </w:t>
-      </w:r>
-      <w:proofErr w:type="gramStart"/>
-      <w:r>
-        <w:rPr>
-          <w:rFonts w:ascii="Times New Roman" w:hAnsi="Times New Roman" w:cs="Times New Roman"/>
-          <w:sz w:val="24"/>
-          <w:szCs w:val="24"/>
-        </w:rPr>
-        <w:t>2 %}</w:t>
+        <w:t>1</w:t>
+      </w:r>
+      <w:r>
+        <w:rPr>
+          <w:rFonts w:ascii="Times New Roman" w:hAnsi="Times New Roman" w:cs="Times New Roman"/>
+          <w:sz w:val="24"/>
+          <w:szCs w:val="24"/>
+        </w:rPr>
+        <w:t xml:space="preserve"> %}</w:t>
       </w:r>
       <w:proofErr w:type="gramEnd"/>
     </w:p>

</xml_diff>